<commit_message>
Update project report with screenshots
</commit_message>
<xml_diff>
--- a/Brithi_ProjectReport.docx
+++ b/Brithi_ProjectReport.docx
@@ -4,15 +4,27 @@
   <w:body>
     <w:p>
       <w:pPr>
+        <w:spacing w:before="1500"/>
         <w:jc w:val="center"/>
       </w:pPr>
       <w:r>
         <w:rPr>
+          <w:rFonts w:ascii="Aptos Display" w:hAnsi="Aptos Display"/>
           <w:b/>
-          <w:color w:val="1F4E79"/>
-          <w:sz w:val="36"/>
+          <w:color w:val="17365D"/>
+          <w:sz w:val="56"/>
         </w:rPr>
-        <w:t>AUTOMATED WEB SECURITY SCANNER</w:t>
+        <w:t>AUTOMATED WEB</w:t>
+      </w:r>
+      <w:r>
+        <w:rPr>
+          <w:rFonts w:ascii="Aptos Display" w:hAnsi="Aptos Display"/>
+          <w:b/>
+          <w:color w:val="17365D"/>
+          <w:sz w:val="56"/>
+        </w:rPr>
+        <w:br/>
+        <w:t>SECURITY SCANNER</w:t>
       </w:r>
     </w:p>
     <w:p>
@@ -21,9 +33,709 @@
       </w:pPr>
       <w:r>
         <w:rPr>
-          <w:b/>
+          <w:color w:val="2F5597"/>
+          <w:sz w:val="38"/>
         </w:rPr>
-        <w:t>Cybersecurity Project Report — Original Version</w:t>
+        <w:t>Project Report</w:t>
+      </w:r>
+    </w:p>
+    <w:p/>
+    <w:tbl>
+      <w:tblPr>
+        <w:tblStyle w:val="TableGrid"/>
+        <w:tblW w:w="0" w:type="auto"/>
+        <w:jc w:val="center"/>
+        <w:tblLook w:val="04A0" w:firstRow="1" w:lastRow="0" w:firstColumn="1" w:lastColumn="0" w:noHBand="0" w:noVBand="1"/>
+      </w:tblPr>
+      <w:tblGrid>
+        <w:gridCol w:w="4968"/>
+        <w:gridCol w:w="4968"/>
+      </w:tblGrid>
+      <w:tr>
+        <w:trPr>
+          <w:jc w:val="center"/>
+        </w:trPr>
+        <w:tc>
+          <w:tcPr>
+            <w:tcW w:w="4968" w:type="dxa"/>
+            <w:shd w:val="clear" w:color="auto" w:fill="D9EAF7"/>
+            <w:vAlign w:val="center"/>
+          </w:tcPr>
+          <w:p>
+            <w:pPr>
+              <w:spacing w:after="20"/>
+            </w:pPr>
+            <w:r>
+              <w:rPr>
+                <w:b/>
+                <w:color w:val="17365D"/>
+              </w:rPr>
+              <w:t>Submitted by</w:t>
+            </w:r>
+          </w:p>
+        </w:tc>
+        <w:tc>
+          <w:tcPr>
+            <w:tcW w:w="4968" w:type="dxa"/>
+            <w:vAlign w:val="center"/>
+          </w:tcPr>
+          <w:p>
+            <w:pPr>
+              <w:spacing w:after="20"/>
+            </w:pPr>
+            <w:proofErr w:type="spellStart"/>
+            <w:r>
+              <w:t>Brithi</w:t>
+            </w:r>
+            <w:r>
+              <w:t>.N</w:t>
+            </w:r>
+            <w:proofErr w:type="spellEnd"/>
+          </w:p>
+        </w:tc>
+      </w:tr>
+      <w:tr>
+        <w:trPr>
+          <w:jc w:val="center"/>
+        </w:trPr>
+        <w:tc>
+          <w:tcPr>
+            <w:tcW w:w="4968" w:type="dxa"/>
+            <w:shd w:val="clear" w:color="auto" w:fill="D9EAF7"/>
+            <w:vAlign w:val="center"/>
+          </w:tcPr>
+          <w:p>
+            <w:pPr>
+              <w:spacing w:after="20"/>
+            </w:pPr>
+            <w:r>
+              <w:rPr>
+                <w:b/>
+                <w:color w:val="17365D"/>
+              </w:rPr>
+              <w:t>Project type</w:t>
+            </w:r>
+          </w:p>
+        </w:tc>
+        <w:tc>
+          <w:tcPr>
+            <w:tcW w:w="4968" w:type="dxa"/>
+            <w:vAlign w:val="center"/>
+          </w:tcPr>
+          <w:p>
+            <w:pPr>
+              <w:spacing w:after="20"/>
+            </w:pPr>
+            <w:r>
+              <w:t>Python-based web security configuration scanner</w:t>
+            </w:r>
+          </w:p>
+        </w:tc>
+      </w:tr>
+      <w:tr>
+        <w:trPr>
+          <w:jc w:val="center"/>
+        </w:trPr>
+        <w:tc>
+          <w:tcPr>
+            <w:tcW w:w="4968" w:type="dxa"/>
+            <w:shd w:val="clear" w:color="auto" w:fill="D9EAF7"/>
+            <w:vAlign w:val="center"/>
+          </w:tcPr>
+          <w:p>
+            <w:pPr>
+              <w:spacing w:after="20"/>
+            </w:pPr>
+            <w:r>
+              <w:rPr>
+                <w:b/>
+                <w:color w:val="17365D"/>
+              </w:rPr>
+              <w:t>Demonstration target</w:t>
+            </w:r>
+          </w:p>
+        </w:tc>
+        <w:tc>
+          <w:tcPr>
+            <w:tcW w:w="4968" w:type="dxa"/>
+            <w:vAlign w:val="center"/>
+          </w:tcPr>
+          <w:p>
+            <w:pPr>
+              <w:spacing w:after="20"/>
+            </w:pPr>
+            <w:r>
+              <w:t>https://example.com</w:t>
+            </w:r>
+          </w:p>
+        </w:tc>
+      </w:tr>
+      <w:tr>
+        <w:trPr>
+          <w:jc w:val="center"/>
+        </w:trPr>
+        <w:tc>
+          <w:tcPr>
+            <w:tcW w:w="4968" w:type="dxa"/>
+            <w:shd w:val="clear" w:color="auto" w:fill="D9EAF7"/>
+            <w:vAlign w:val="center"/>
+          </w:tcPr>
+          <w:p>
+            <w:pPr>
+              <w:spacing w:after="20"/>
+            </w:pPr>
+            <w:r>
+              <w:rPr>
+                <w:b/>
+                <w:color w:val="17365D"/>
+              </w:rPr>
+              <w:t>Report date</w:t>
+            </w:r>
+          </w:p>
+        </w:tc>
+        <w:tc>
+          <w:tcPr>
+            <w:tcW w:w="4968" w:type="dxa"/>
+            <w:vAlign w:val="center"/>
+          </w:tcPr>
+          <w:p>
+            <w:pPr>
+              <w:spacing w:after="20"/>
+            </w:pPr>
+            <w:r>
+              <w:t>23 October 2026</w:t>
+            </w:r>
+          </w:p>
+        </w:tc>
+      </w:tr>
+    </w:tbl>
+    <w:p/>
+    <w:p>
+      <w:pPr>
+        <w:ind w:left="648" w:right="648"/>
+        <w:jc w:val="center"/>
+      </w:pPr>
+      <w:r>
+        <w:t>A lightweight educational tool that checks selected HTTP response security headers and produces human-readable HTML and machine-readable JSON reports.</w:t>
+      </w:r>
+    </w:p>
+    <w:p>
+      <w:r>
+        <w:br w:type="page"/>
+      </w:r>
+    </w:p>
+    <w:p>
+      <w:pPr>
+        <w:pStyle w:val="Heading1"/>
+      </w:pPr>
+      <w:r>
+        <w:lastRenderedPageBreak/>
+        <w:t>1. Executive Summary</w:t>
+      </w:r>
+    </w:p>
+    <w:p>
+      <w:r>
+        <w:t>The Automated Web Security Scanner is a Python command-line application designed to perform a small, non-invasive review of a website’s HTTP response configuration. It sends a request to a supplied URL, inspects the response status and selected headers, assigns severity levels to observations, and exports the results into HTML and JSON files.</w:t>
+      </w:r>
+    </w:p>
+    <w:p>
+      <w:r>
+        <w:t>For the demonstration shown in the attached evidence, the scan completed successfully against https://example.com and received HTTP status 200. The generated report listed seven findings: two High, two Medium, and three Low; no Informational findings were recorded. These results describe the scanner’s observations for this single run and should not be interpreted as proof that the target is vulnerable or secure.</w:t>
+      </w:r>
+    </w:p>
+    <w:p>
+      <w:pPr>
+        <w:pStyle w:val="Heading2"/>
+      </w:pPr>
+      <w:r>
+        <w:t>Project at a glance</w:t>
+      </w:r>
+    </w:p>
+    <w:tbl>
+      <w:tblPr>
+        <w:tblStyle w:val="TableGrid"/>
+        <w:tblW w:w="0" w:type="auto"/>
+        <w:jc w:val="center"/>
+        <w:tblLook w:val="04A0" w:firstRow="1" w:lastRow="0" w:firstColumn="1" w:lastColumn="0" w:noHBand="0" w:noVBand="1"/>
+      </w:tblPr>
+      <w:tblGrid>
+        <w:gridCol w:w="4968"/>
+        <w:gridCol w:w="4968"/>
+      </w:tblGrid>
+      <w:tr>
+        <w:trPr>
+          <w:jc w:val="center"/>
+        </w:trPr>
+        <w:tc>
+          <w:tcPr>
+            <w:tcW w:w="4968" w:type="dxa"/>
+            <w:shd w:val="clear" w:color="auto" w:fill="17365D"/>
+            <w:vAlign w:val="center"/>
+          </w:tcPr>
+          <w:p>
+            <w:pPr>
+              <w:spacing w:after="20"/>
+            </w:pPr>
+            <w:r>
+              <w:rPr>
+                <w:b/>
+                <w:color w:val="FFFFFF"/>
+              </w:rPr>
+              <w:t>Item</w:t>
+            </w:r>
+          </w:p>
+        </w:tc>
+        <w:tc>
+          <w:tcPr>
+            <w:tcW w:w="4968" w:type="dxa"/>
+            <w:shd w:val="clear" w:color="auto" w:fill="17365D"/>
+            <w:vAlign w:val="center"/>
+          </w:tcPr>
+          <w:p>
+            <w:pPr>
+              <w:spacing w:after="20"/>
+            </w:pPr>
+            <w:r>
+              <w:rPr>
+                <w:b/>
+                <w:color w:val="FFFFFF"/>
+              </w:rPr>
+              <w:t>Details</w:t>
+            </w:r>
+          </w:p>
+        </w:tc>
+      </w:tr>
+      <w:tr>
+        <w:trPr>
+          <w:jc w:val="center"/>
+        </w:trPr>
+        <w:tc>
+          <w:tcPr>
+            <w:tcW w:w="4968" w:type="dxa"/>
+            <w:vAlign w:val="center"/>
+          </w:tcPr>
+          <w:p>
+            <w:pPr>
+              <w:spacing w:after="20"/>
+            </w:pPr>
+            <w:r>
+              <w:rPr>
+                <w:b/>
+                <w:sz w:val="18"/>
+              </w:rPr>
+              <w:t>Language</w:t>
+            </w:r>
+          </w:p>
+        </w:tc>
+        <w:tc>
+          <w:tcPr>
+            <w:tcW w:w="4968" w:type="dxa"/>
+            <w:vAlign w:val="center"/>
+          </w:tcPr>
+          <w:p>
+            <w:pPr>
+              <w:spacing w:after="20"/>
+            </w:pPr>
+            <w:r>
+              <w:rPr>
+                <w:sz w:val="18"/>
+              </w:rPr>
+              <w:t>Python</w:t>
+            </w:r>
+          </w:p>
+        </w:tc>
+      </w:tr>
+      <w:tr>
+        <w:trPr>
+          <w:jc w:val="center"/>
+        </w:trPr>
+        <w:tc>
+          <w:tcPr>
+            <w:tcW w:w="4968" w:type="dxa"/>
+            <w:vAlign w:val="center"/>
+          </w:tcPr>
+          <w:p>
+            <w:pPr>
+              <w:spacing w:after="20"/>
+            </w:pPr>
+            <w:r>
+              <w:rPr>
+                <w:b/>
+                <w:sz w:val="18"/>
+              </w:rPr>
+              <w:t>Interface</w:t>
+            </w:r>
+          </w:p>
+        </w:tc>
+        <w:tc>
+          <w:tcPr>
+            <w:tcW w:w="4968" w:type="dxa"/>
+            <w:vAlign w:val="center"/>
+          </w:tcPr>
+          <w:p>
+            <w:pPr>
+              <w:spacing w:after="20"/>
+            </w:pPr>
+            <w:r>
+              <w:rPr>
+                <w:sz w:val="18"/>
+              </w:rPr>
+              <w:t>Command-line terminal</w:t>
+            </w:r>
+          </w:p>
+        </w:tc>
+      </w:tr>
+      <w:tr>
+        <w:trPr>
+          <w:jc w:val="center"/>
+        </w:trPr>
+        <w:tc>
+          <w:tcPr>
+            <w:tcW w:w="4968" w:type="dxa"/>
+            <w:vAlign w:val="center"/>
+          </w:tcPr>
+          <w:p>
+            <w:pPr>
+              <w:spacing w:after="20"/>
+            </w:pPr>
+            <w:r>
+              <w:rPr>
+                <w:b/>
+                <w:sz w:val="18"/>
+              </w:rPr>
+              <w:t>Input</w:t>
+            </w:r>
+          </w:p>
+        </w:tc>
+        <w:tc>
+          <w:tcPr>
+            <w:tcW w:w="4968" w:type="dxa"/>
+            <w:vAlign w:val="center"/>
+          </w:tcPr>
+          <w:p>
+            <w:pPr>
+              <w:spacing w:after="20"/>
+            </w:pPr>
+            <w:r>
+              <w:rPr>
+                <w:sz w:val="18"/>
+              </w:rPr>
+              <w:t>A website URL supplied by the user</w:t>
+            </w:r>
+          </w:p>
+        </w:tc>
+      </w:tr>
+      <w:tr>
+        <w:trPr>
+          <w:jc w:val="center"/>
+        </w:trPr>
+        <w:tc>
+          <w:tcPr>
+            <w:tcW w:w="4968" w:type="dxa"/>
+            <w:vAlign w:val="center"/>
+          </w:tcPr>
+          <w:p>
+            <w:pPr>
+              <w:spacing w:after="20"/>
+            </w:pPr>
+            <w:r>
+              <w:rPr>
+                <w:b/>
+                <w:sz w:val="18"/>
+              </w:rPr>
+              <w:t>Checks</w:t>
+            </w:r>
+          </w:p>
+        </w:tc>
+        <w:tc>
+          <w:tcPr>
+            <w:tcW w:w="4968" w:type="dxa"/>
+            <w:vAlign w:val="center"/>
+          </w:tcPr>
+          <w:p>
+            <w:pPr>
+              <w:spacing w:after="20"/>
+            </w:pPr>
+            <w:r>
+              <w:rPr>
+                <w:sz w:val="18"/>
+              </w:rPr>
+              <w:t>Selected HTTP response headers and server-header disclosure</w:t>
+            </w:r>
+          </w:p>
+        </w:tc>
+      </w:tr>
+      <w:tr>
+        <w:trPr>
+          <w:jc w:val="center"/>
+        </w:trPr>
+        <w:tc>
+          <w:tcPr>
+            <w:tcW w:w="4968" w:type="dxa"/>
+            <w:vAlign w:val="center"/>
+          </w:tcPr>
+          <w:p>
+            <w:pPr>
+              <w:spacing w:after="20"/>
+            </w:pPr>
+            <w:r>
+              <w:rPr>
+                <w:b/>
+                <w:sz w:val="18"/>
+              </w:rPr>
+              <w:t>Outputs</w:t>
+            </w:r>
+          </w:p>
+        </w:tc>
+        <w:tc>
+          <w:tcPr>
+            <w:tcW w:w="4968" w:type="dxa"/>
+            <w:vAlign w:val="center"/>
+          </w:tcPr>
+          <w:p>
+            <w:pPr>
+              <w:spacing w:after="20"/>
+            </w:pPr>
+            <w:r>
+              <w:rPr>
+                <w:sz w:val="18"/>
+              </w:rPr>
+              <w:t>HTML report and JSON data file</w:t>
+            </w:r>
+          </w:p>
+        </w:tc>
+      </w:tr>
+      <w:tr>
+        <w:trPr>
+          <w:jc w:val="center"/>
+        </w:trPr>
+        <w:tc>
+          <w:tcPr>
+            <w:tcW w:w="4968" w:type="dxa"/>
+            <w:vAlign w:val="center"/>
+          </w:tcPr>
+          <w:p>
+            <w:pPr>
+              <w:spacing w:after="20"/>
+            </w:pPr>
+            <w:r>
+              <w:rPr>
+                <w:b/>
+                <w:sz w:val="18"/>
+              </w:rPr>
+              <w:t>Demonstration status</w:t>
+            </w:r>
+          </w:p>
+        </w:tc>
+        <w:tc>
+          <w:tcPr>
+            <w:tcW w:w="4968" w:type="dxa"/>
+            <w:vAlign w:val="center"/>
+          </w:tcPr>
+          <w:p>
+            <w:pPr>
+              <w:spacing w:after="20"/>
+            </w:pPr>
+            <w:r>
+              <w:rPr>
+                <w:sz w:val="18"/>
+              </w:rPr>
+              <w:t>Completed; HTTP status 200</w:t>
+            </w:r>
+          </w:p>
+        </w:tc>
+      </w:tr>
+    </w:tbl>
+    <w:p>
+      <w:pPr>
+        <w:pStyle w:val="Heading1"/>
+      </w:pPr>
+      <w:r>
+        <w:t>2. Problem Statement</w:t>
+      </w:r>
+    </w:p>
+    <w:p>
+      <w:r>
+        <w:t>Web applications rely on HTTP response headers to communicate security-related browser policies. When recommended headers are absent or server details are disclosed, developers may miss opportunities to strengthen a site’s configuration. Manually checking these signals across a response can be repetitive, especially for a basic educational review.</w:t>
+      </w:r>
+    </w:p>
+    <w:p>
+      <w:r>
+        <w:t>This project addresses that narrow use case by automating a set of header checks and presenting the observations with severity, evidence, and a suggested remediation. It is intentionally a lightweight scanner rather than a full vulnerability assessment platform.</w:t>
+      </w:r>
+    </w:p>
+    <w:p>
+      <w:pPr>
+        <w:pStyle w:val="Heading1"/>
+      </w:pPr>
+      <w:r>
+        <w:t>3. Objectives</w:t>
+      </w:r>
+    </w:p>
+    <w:p>
+      <w:pPr>
+        <w:pStyle w:val="ListBullet"/>
+      </w:pPr>
+      <w:r>
+        <w:t>Accept a target URL through a simple command-line interface.</w:t>
+      </w:r>
+    </w:p>
+    <w:p>
+      <w:pPr>
+        <w:pStyle w:val="ListBullet"/>
+      </w:pPr>
+      <w:r>
+        <w:t>Make a non-invasive HTTP request and record the response status and final URL.</w:t>
+      </w:r>
+    </w:p>
+    <w:p>
+      <w:pPr>
+        <w:pStyle w:val="ListBullet"/>
+      </w:pPr>
+      <w:r>
+        <w:t>Inspect selected security-related response headers.</w:t>
+      </w:r>
+    </w:p>
+    <w:p>
+      <w:pPr>
+        <w:pStyle w:val="ListBullet"/>
+      </w:pPr>
+      <w:r>
+        <w:t>Report missing headers or selected disclosure signals with severity labels.</w:t>
+      </w:r>
+    </w:p>
+    <w:p>
+      <w:pPr>
+        <w:pStyle w:val="ListBullet"/>
+      </w:pPr>
+      <w:r>
+        <w:t>Provide recommendations that help a developer decide what to review next.</w:t>
+      </w:r>
+    </w:p>
+    <w:p>
+      <w:pPr>
+        <w:pStyle w:val="ListBullet"/>
+      </w:pPr>
+      <w:r>
+        <w:t>Save findings in both HTML (for people) and JSON (for tools or further processing).</w:t>
+      </w:r>
+    </w:p>
+    <w:p>
+      <w:pPr>
+        <w:pStyle w:val="Heading1"/>
+      </w:pPr>
+      <w:r>
+        <w:t>4. Scope and Limitations</w:t>
+      </w:r>
+    </w:p>
+    <w:p>
+      <w:pPr>
+        <w:pStyle w:val="Heading2"/>
+      </w:pPr>
+      <w:r>
+        <w:t>Included in this project</w:t>
+      </w:r>
+    </w:p>
+    <w:p>
+      <w:pPr>
+        <w:pStyle w:val="ListBullet"/>
+      </w:pPr>
+      <w:r>
+        <w:t>A lightweight request-based configuration review.</w:t>
+      </w:r>
+    </w:p>
+    <w:p>
+      <w:pPr>
+        <w:pStyle w:val="ListBullet"/>
+      </w:pPr>
+      <w:r>
+        <w:t>Checks for selected response headers, including Strict-Transport-Security, Content-Security-Policy, X-Content-Type-Options, X-Frame-Options, Referrer-Policy, and Permissions-Policy.</w:t>
+      </w:r>
+    </w:p>
+    <w:p>
+      <w:pPr>
+        <w:pStyle w:val="ListBullet"/>
+      </w:pPr>
+      <w:r>
+        <w:lastRenderedPageBreak/>
+        <w:t>A check for server-header disclosure.</w:t>
+      </w:r>
+    </w:p>
+    <w:p>
+      <w:pPr>
+        <w:pStyle w:val="ListBullet"/>
+      </w:pPr>
+      <w:r>
+        <w:t>Severity summaries and evidence/recommendation text.</w:t>
+      </w:r>
+    </w:p>
+    <w:p>
+      <w:pPr>
+        <w:pStyle w:val="ListBullet"/>
+      </w:pPr>
+      <w:r>
+        <w:t>HTML and JSON report generation.</w:t>
+      </w:r>
+    </w:p>
+    <w:p>
+      <w:pPr>
+        <w:pStyle w:val="Heading2"/>
+      </w:pPr>
+      <w:r>
+        <w:t>Not included</w:t>
+      </w:r>
+    </w:p>
+    <w:p>
+      <w:pPr>
+        <w:pStyle w:val="ListBullet"/>
+      </w:pPr>
+      <w:r>
+        <w:t>Exploitation, payload injection, brute-force attempts, or penetration testing.</w:t>
+      </w:r>
+    </w:p>
+    <w:p>
+      <w:pPr>
+        <w:pStyle w:val="ListBullet"/>
+      </w:pPr>
+      <w:r>
+        <w:t>Authentication or testing of protected application functionality.</w:t>
+      </w:r>
+    </w:p>
+    <w:p>
+      <w:pPr>
+        <w:pStyle w:val="ListBullet"/>
+      </w:pPr>
+      <w:r>
+        <w:t>Crawling a whole website or testing every page and subdomain.</w:t>
+      </w:r>
+    </w:p>
+    <w:p>
+      <w:pPr>
+        <w:pStyle w:val="ListBullet"/>
+      </w:pPr>
+      <w:r>
+        <w:t>Proof that a missing header creates an exploitable vulnerability.</w:t>
+      </w:r>
+    </w:p>
+    <w:p>
+      <w:pPr>
+        <w:pStyle w:val="ListBullet"/>
+      </w:pPr>
+      <w:r>
+        <w:t>A guarantee that a website is secure or insecure.</w:t>
+      </w:r>
+    </w:p>
+    <w:p>
+      <w:r>
+        <w:t>Important: use this tool only on systems you own or have explicit permission to assess. The example.com run is a demonstration, not an authorization to scan unrelated systems.</w:t>
+      </w:r>
+    </w:p>
+    <w:p>
+      <w:pPr>
+        <w:pStyle w:val="Heading1"/>
+      </w:pPr>
+      <w:r>
+        <w:t>5. Technologies Used</w:t>
       </w:r>
     </w:p>
     <w:tbl>
@@ -40,26 +752,38 @@
         <w:tc>
           <w:tcPr>
             <w:tcW w:w="4968" w:type="dxa"/>
+            <w:shd w:val="clear" w:color="auto" w:fill="17365D"/>
+            <w:vAlign w:val="center"/>
           </w:tcPr>
           <w:p>
+            <w:pPr>
+              <w:spacing w:after="20"/>
+            </w:pPr>
             <w:r>
               <w:rPr>
                 <w:b/>
+                <w:color w:val="FFFFFF"/>
               </w:rPr>
-              <w:t>Student Name</w:t>
+              <w:t>Technology</w:t>
             </w:r>
           </w:p>
         </w:tc>
         <w:tc>
           <w:tcPr>
             <w:tcW w:w="4968" w:type="dxa"/>
+            <w:shd w:val="clear" w:color="auto" w:fill="17365D"/>
+            <w:vAlign w:val="center"/>
           </w:tcPr>
           <w:p>
+            <w:pPr>
+              <w:spacing w:after="20"/>
+            </w:pPr>
             <w:r>
-              <w:t>Brithi</w:t>
-            </w:r>
-            <w:r>
-              <w:t>.N</w:t>
+              <w:rPr>
+                <w:b/>
+                <w:color w:val="FFFFFF"/>
+              </w:rPr>
+              <w:t>Purpose</w:t>
             </w:r>
           </w:p>
         </w:tc>
@@ -68,23 +792,35 @@
         <w:tc>
           <w:tcPr>
             <w:tcW w:w="4968" w:type="dxa"/>
+            <w:vAlign w:val="center"/>
           </w:tcPr>
           <w:p>
+            <w:pPr>
+              <w:spacing w:after="20"/>
+            </w:pPr>
             <w:r>
               <w:rPr>
                 <w:b/>
+                <w:sz w:val="18"/>
               </w:rPr>
-              <w:t>Program</w:t>
+              <w:t>Python</w:t>
             </w:r>
           </w:p>
         </w:tc>
         <w:tc>
           <w:tcPr>
             <w:tcW w:w="4968" w:type="dxa"/>
+            <w:vAlign w:val="center"/>
           </w:tcPr>
           <w:p>
+            <w:pPr>
+              <w:spacing w:after="20"/>
+            </w:pPr>
             <w:r>
-              <w:t>IBM SkillsBuild National Cybersecurity Bootcamp</w:t>
+              <w:rPr>
+                <w:sz w:val="18"/>
+              </w:rPr>
+              <w:t>Implements the scanning logic, severity classification, and report generation.</w:t>
             </w:r>
           </w:p>
         </w:tc>
@@ -93,23 +829,35 @@
         <w:tc>
           <w:tcPr>
             <w:tcW w:w="4968" w:type="dxa"/>
+            <w:vAlign w:val="center"/>
           </w:tcPr>
           <w:p>
+            <w:pPr>
+              <w:spacing w:after="20"/>
+            </w:pPr>
             <w:r>
               <w:rPr>
                 <w:b/>
+                <w:sz w:val="18"/>
               </w:rPr>
-              <w:t>Organization</w:t>
+              <w:t>HTTP request/response handling</w:t>
             </w:r>
           </w:p>
         </w:tc>
         <w:tc>
           <w:tcPr>
             <w:tcW w:w="4968" w:type="dxa"/>
+            <w:vAlign w:val="center"/>
           </w:tcPr>
           <w:p>
+            <w:pPr>
+              <w:spacing w:after="20"/>
+            </w:pPr>
             <w:r>
-              <w:t>BharatCares (CSRBOX Group)</w:t>
+              <w:rPr>
+                <w:sz w:val="18"/>
+              </w:rPr>
+              <w:t>Obtains a response and reads its status, URL, and headers.</w:t>
             </w:r>
           </w:p>
         </w:tc>
@@ -118,23 +866,109 @@
         <w:tc>
           <w:tcPr>
             <w:tcW w:w="4968" w:type="dxa"/>
+            <w:vAlign w:val="center"/>
           </w:tcPr>
           <w:p>
+            <w:pPr>
+              <w:spacing w:after="20"/>
+            </w:pPr>
             <w:r>
               <w:rPr>
                 <w:b/>
+                <w:sz w:val="18"/>
               </w:rPr>
-              <w:t>Project Type</w:t>
+              <w:t>HTML and CSS</w:t>
             </w:r>
           </w:p>
         </w:tc>
         <w:tc>
           <w:tcPr>
             <w:tcW w:w="4968" w:type="dxa"/>
+            <w:vAlign w:val="center"/>
           </w:tcPr>
           <w:p>
+            <w:pPr>
+              <w:spacing w:after="20"/>
+            </w:pPr>
             <w:r>
-              <w:t>Python-based web security configuration scanner</w:t>
+              <w:rPr>
+                <w:sz w:val="18"/>
+              </w:rPr>
+              <w:t>Formats a readable report with a summary and findings table.</w:t>
+            </w:r>
+          </w:p>
+        </w:tc>
+      </w:tr>
+      <w:tr>
+        <w:tc>
+          <w:tcPr>
+            <w:tcW w:w="4968" w:type="dxa"/>
+            <w:vAlign w:val="center"/>
+          </w:tcPr>
+          <w:p>
+            <w:pPr>
+              <w:spacing w:after="20"/>
+            </w:pPr>
+            <w:r>
+              <w:rPr>
+                <w:b/>
+                <w:sz w:val="18"/>
+              </w:rPr>
+              <w:t>JSON</w:t>
+            </w:r>
+          </w:p>
+        </w:tc>
+        <w:tc>
+          <w:tcPr>
+            <w:tcW w:w="4968" w:type="dxa"/>
+            <w:vAlign w:val="center"/>
+          </w:tcPr>
+          <w:p>
+            <w:pPr>
+              <w:spacing w:after="20"/>
+            </w:pPr>
+            <w:r>
+              <w:rPr>
+                <w:sz w:val="18"/>
+              </w:rPr>
+              <w:t>Stores structured scan output for later inspection or processing.</w:t>
+            </w:r>
+          </w:p>
+        </w:tc>
+      </w:tr>
+      <w:tr>
+        <w:tc>
+          <w:tcPr>
+            <w:tcW w:w="4968" w:type="dxa"/>
+            <w:vAlign w:val="center"/>
+          </w:tcPr>
+          <w:p>
+            <w:pPr>
+              <w:spacing w:after="20"/>
+            </w:pPr>
+            <w:r>
+              <w:rPr>
+                <w:b/>
+                <w:sz w:val="18"/>
+              </w:rPr>
+              <w:t>Visual Studio Code and PowerShell</w:t>
+            </w:r>
+          </w:p>
+        </w:tc>
+        <w:tc>
+          <w:tcPr>
+            <w:tcW w:w="4968" w:type="dxa"/>
+            <w:vAlign w:val="center"/>
+          </w:tcPr>
+          <w:p>
+            <w:pPr>
+              <w:spacing w:after="20"/>
+            </w:pPr>
+            <w:r>
+              <w:rPr>
+                <w:sz w:val="18"/>
+              </w:rPr>
+              <w:t>Used to edit and run the project in the demonstrated Windows environment.</w:t>
             </w:r>
           </w:p>
         </w:tc>
@@ -145,25 +979,129 @@
         <w:pStyle w:val="Heading1"/>
       </w:pPr>
       <w:r>
-        <w:t>1. Abstract</w:t>
+        <w:t>6. How the Scanner Works</w:t>
+      </w:r>
+    </w:p>
+    <w:p>
+      <w:pPr>
+        <w:pStyle w:val="ListNumber"/>
+      </w:pPr>
+      <w:r>
+        <w:t>Input: the user supplies a URL and an output-name prefix.</w:t>
+      </w:r>
+    </w:p>
+    <w:p>
+      <w:pPr>
+        <w:pStyle w:val="ListNumber"/>
+      </w:pPr>
+      <w:r>
+        <w:t>Request: the scanner sends a lightweight HTTP request to retrieve response metadata.</w:t>
+      </w:r>
+    </w:p>
+    <w:p>
+      <w:pPr>
+        <w:pStyle w:val="ListNumber"/>
+      </w:pPr>
+      <w:r>
+        <w:t>Inspection: the scanner checks selected headers and records missing-header or disclosure observations.</w:t>
+      </w:r>
+    </w:p>
+    <w:p>
+      <w:pPr>
+        <w:pStyle w:val="ListNumber"/>
+      </w:pPr>
+      <w:r>
+        <w:t>Classification: each observation is assigned a severity level and paired with evidence and a recommendation.</w:t>
+      </w:r>
+    </w:p>
+    <w:p>
+      <w:pPr>
+        <w:pStyle w:val="ListNumber"/>
+      </w:pPr>
+      <w:r>
+        <w:t>Summary: findings are counted by severity.</w:t>
+      </w:r>
+    </w:p>
+    <w:p>
+      <w:pPr>
+        <w:pStyle w:val="ListNumber"/>
+      </w:pPr>
+      <w:r>
+        <w:t>Export: the program writes a JSON file and an HTML report using the same scan results.</w:t>
+      </w:r>
+    </w:p>
+    <w:p>
+      <w:pPr>
+        <w:pStyle w:val="Heading1"/>
+      </w:pPr>
+      <w:r>
+        <w:t>7. How to Run the Project</w:t>
       </w:r>
     </w:p>
     <w:p>
       <w:r>
-        <w:t>The Automated Web Security Scanner is a small Python application that checks selected web security configuration signals for a supplied website. It makes a normal HTTP GET request, follows redirects, reviews the final URL scheme, checks common security response headers, notes the Server response header, and examines security attributes on returned cookies. It generates HTML and JSON reports containing findings, evidence, severity labels, and recommendations. The project is intended for educational awareness and basic configuration review.</w:t>
+        <w:t>Open PowerShell in the folder containing Brithi_Automated_Web_Security_Scanner.py and requirements.txt. Run the following commands one at a time:</w:t>
       </w:r>
     </w:p>
     <w:p>
       <w:pPr>
-        <w:pStyle w:val="Heading1"/>
+        <w:spacing w:after="60"/>
+        <w:ind w:left="360"/>
       </w:pPr>
       <w:r>
-        <w:t>2. Problem Statement</w:t>
+        <w:rPr>
+          <w:rFonts w:ascii="Consolas" w:hAnsi="Consolas"/>
+          <w:color w:val="234B73"/>
+          <w:sz w:val="18"/>
+        </w:rPr>
+        <w:t>py -m venv .venv</w:t>
+      </w:r>
+    </w:p>
+    <w:p>
+      <w:pPr>
+        <w:spacing w:after="60"/>
+        <w:ind w:left="360"/>
+      </w:pPr>
+      <w:r>
+        <w:rPr>
+          <w:rFonts w:ascii="Consolas" w:hAnsi="Consolas"/>
+          <w:color w:val="234B73"/>
+          <w:sz w:val="18"/>
+        </w:rPr>
+        <w:t>.\.venv\Scripts\Activate.ps1</w:t>
+      </w:r>
+    </w:p>
+    <w:p>
+      <w:pPr>
+        <w:spacing w:after="60"/>
+        <w:ind w:left="360"/>
+      </w:pPr>
+      <w:r>
+        <w:rPr>
+          <w:rFonts w:ascii="Consolas" w:hAnsi="Consolas"/>
+          <w:color w:val="234B73"/>
+          <w:sz w:val="18"/>
+        </w:rPr>
+        <w:t>python -m pip install -r requirements.txt</w:t>
+      </w:r>
+    </w:p>
+    <w:p>
+      <w:pPr>
+        <w:spacing w:after="60"/>
+        <w:ind w:left="360"/>
+      </w:pPr>
+      <w:r>
+        <w:rPr>
+          <w:rFonts w:ascii="Consolas" w:hAnsi="Consolas"/>
+          <w:color w:val="234B73"/>
+          <w:sz w:val="18"/>
+        </w:rPr>
+        <w:t>python Brithi_Automated_Web_Security_Scanner.py https://example.com --out demo_report</w:t>
       </w:r>
     </w:p>
     <w:p>
       <w:r>
-        <w:t>Websites may omit browser security headers or disclose server information in HTTP responses. Checking these settings manually can be repetitive. A small automated tool can gather selected observations and present recommendations in a consistent format.</w:t>
+        <w:t>After a successful run, the terminal should show the scan status, HTTP status, finding counts, and the names of the saved report files. The expected output names for the command above are demo_report.html and demo_report.json. If the project folder or script name differs, adjust the command to match the actual filenames.</w:t>
       </w:r>
     </w:p>
     <w:p>
@@ -171,191 +1109,13 @@
         <w:pStyle w:val="Heading1"/>
       </w:pPr>
       <w:r>
-        <w:t>3. Objectives</w:t>
-      </w:r>
-    </w:p>
-    <w:p>
-      <w:pPr>
-        <w:pStyle w:val="ListBullet"/>
-      </w:pPr>
-      <w:r>
-        <w:t>Accept and validate a URL supplied by the user.</w:t>
-      </w:r>
-    </w:p>
-    <w:p>
-      <w:pPr>
-        <w:pStyle w:val="ListBullet"/>
-      </w:pPr>
-      <w:r>
-        <w:t>Check whether the final URL uses HTTPS.</w:t>
-      </w:r>
-    </w:p>
-    <w:p>
-      <w:pPr>
-        <w:pStyle w:val="ListBullet"/>
-      </w:pPr>
-      <w:r>
-        <w:t>Review six common HTTP security response headers.</w:t>
-      </w:r>
-    </w:p>
-    <w:p>
-      <w:pPr>
-        <w:pStyle w:val="ListBullet"/>
-      </w:pPr>
-      <w:r>
-        <w:t>Identify a disclosed Server header and inspect returned cookie attributes.</w:t>
-      </w:r>
-    </w:p>
-    <w:p>
-      <w:pPr>
-        <w:pStyle w:val="ListBullet"/>
-      </w:pPr>
-      <w:r>
-        <w:t>Generate HTML and JSON reports containing findings and recommendations.</w:t>
-      </w:r>
-    </w:p>
-    <w:p>
-      <w:pPr>
-        <w:pStyle w:val="Heading1"/>
-      </w:pPr>
-      <w:r>
-        <w:t>4. Tools and Technologies</w:t>
-      </w:r>
-    </w:p>
-    <w:p>
-      <w:pPr>
-        <w:pStyle w:val="ListBullet"/>
-      </w:pPr>
-      <w:r>
-        <w:t>Python 3 for scan logic and command-line arguments.</w:t>
-      </w:r>
-    </w:p>
-    <w:p>
-      <w:pPr>
-        <w:pStyle w:val="ListBullet"/>
-      </w:pPr>
-      <w:r>
-        <w:t>Requests for making the HTTP request and inspecting the response.</w:t>
-      </w:r>
-    </w:p>
-    <w:p>
-      <w:pPr>
-        <w:pStyle w:val="ListBullet"/>
-      </w:pPr>
-      <w:r>
-        <w:t>HTML and CSS for the browser-readable report.</w:t>
-      </w:r>
-    </w:p>
-    <w:p>
-      <w:pPr>
-        <w:pStyle w:val="ListBullet"/>
-      </w:pPr>
-      <w:r>
-        <w:t>JSON for structured results.</w:t>
-      </w:r>
-    </w:p>
-    <w:p>
-      <w:pPr>
-        <w:pStyle w:val="ListBullet"/>
-      </w:pPr>
-      <w:r>
-        <w:t>Visual Studio Code and PowerShell for development and execution.</w:t>
-      </w:r>
-    </w:p>
-    <w:p>
-      <w:pPr>
-        <w:pStyle w:val="Heading1"/>
-      </w:pPr>
-      <w:r>
-        <w:t>5. Methodology</w:t>
-      </w:r>
-    </w:p>
-    <w:p>
-      <w:pPr>
-        <w:pStyle w:val="ListNumber"/>
-      </w:pPr>
-      <w:r>
-        <w:t>The user supplies a target URL in the command line.</w:t>
-      </w:r>
-    </w:p>
-    <w:p>
-      <w:pPr>
-        <w:pStyle w:val="ListNumber"/>
-      </w:pPr>
-      <w:r>
-        <w:t>The program validates the URL and adds HTTPS if the scheme is omitted.</w:t>
-      </w:r>
-    </w:p>
-    <w:p>
-      <w:pPr>
-        <w:pStyle w:val="ListNumber"/>
-      </w:pPr>
-      <w:r>
-        <w:t>The scanner sends one ordinary GET request with a timeout and follows redirects.</w:t>
-      </w:r>
-    </w:p>
-    <w:p>
-      <w:pPr>
-        <w:pStyle w:val="ListNumber"/>
-      </w:pPr>
-      <w:r>
-        <w:t>It checks the final URL, six selected security headers, the Server header, and returned cookie attributes.</w:t>
-      </w:r>
-    </w:p>
-    <w:p>
-      <w:pPr>
-        <w:pStyle w:val="ListNumber"/>
-      </w:pPr>
-      <w:r>
-        <w:t>It assigns severity labels and recommendations to observations.</w:t>
-      </w:r>
-    </w:p>
-    <w:p>
-      <w:pPr>
-        <w:pStyle w:val="ListNumber"/>
-      </w:pPr>
-      <w:r>
-        <w:t>It saves the results in JSON and HTML formats.</w:t>
-      </w:r>
-    </w:p>
-    <w:p>
-      <w:pPr>
-        <w:pStyle w:val="Heading1"/>
-      </w:pPr>
-      <w:r>
         <w:lastRenderedPageBreak/>
-        <w:t>6. System Workflow</w:t>
+        <w:t>8. Demonstration Results</w:t>
       </w:r>
     </w:p>
     <w:p>
       <w:r>
-        <w:t>Target URL → URL validation → HTTP GET request → response/header/cookie inspection → finding classification → JSON and HTML report generation.</w:t>
-      </w:r>
-    </w:p>
-    <w:p>
-      <w:pPr>
-        <w:pStyle w:val="Heading1"/>
-      </w:pPr>
-      <w:r>
-        <w:t>7. Implementation</w:t>
-      </w:r>
-    </w:p>
-    <w:p>
-      <w:r>
-        <w:t>The complete implementation is provided in `Brithi_Automated_Web_Security_Scanner.py`. The program includes URL normalization, the scan function, security-header checks, cookie-attribute checks, severity summary calculation, HTML report generation, JSON export, and a command-line interface. The only external dependency is Requests, listed in `requirements.txt`.</w:t>
-      </w:r>
-    </w:p>
-    <w:p>
-      <w:pPr>
-        <w:pStyle w:val="Heading1"/>
-      </w:pPr>
-      <w:r>
-        <w:t>8. Demonstration and Results</w:t>
-      </w:r>
-    </w:p>
-    <w:p>
-      <w:r>
-        <w:t>During the recorded development run against https://example.com, the terminal displayed Status: completed and HTTP status: 200. It reported 7 findings: 2 High, 2 Medium, 3 Low, and 0 Informational. The program saved `demo_report.json` and `demo_report.html`, and the HTML report displayed the target, scan time, HTTP status, summary, findings, and recommendations.</w:t>
+        <w:t>The supplied terminal screenshot shows that the scanner completed its run. The response returned HTTP status 200, and the program saved both report formats.</w:t>
       </w:r>
     </w:p>
     <w:tbl>
@@ -365,47 +1125,45 @@
         <w:tblLook w:val="04A0" w:firstRow="1" w:lastRow="0" w:firstColumn="1" w:lastColumn="0" w:noHBand="0" w:noVBand="1"/>
       </w:tblPr>
       <w:tblGrid>
-        <w:gridCol w:w="3312"/>
-        <w:gridCol w:w="3312"/>
-        <w:gridCol w:w="3312"/>
+        <w:gridCol w:w="4968"/>
+        <w:gridCol w:w="4968"/>
       </w:tblGrid>
       <w:tr>
         <w:tc>
           <w:tcPr>
-            <w:tcW w:w="3312" w:type="dxa"/>
+            <w:tcW w:w="4968" w:type="dxa"/>
+            <w:shd w:val="clear" w:color="auto" w:fill="17365D"/>
+            <w:vAlign w:val="center"/>
           </w:tcPr>
           <w:p>
+            <w:pPr>
+              <w:spacing w:after="20"/>
+            </w:pPr>
             <w:r>
               <w:rPr>
                 <w:b/>
+                <w:color w:val="FFFFFF"/>
               </w:rPr>
-              <w:t>Test</w:t>
+              <w:t>Metric</w:t>
             </w:r>
           </w:p>
         </w:tc>
         <w:tc>
           <w:tcPr>
-            <w:tcW w:w="3312" w:type="dxa"/>
+            <w:tcW w:w="4968" w:type="dxa"/>
+            <w:shd w:val="clear" w:color="auto" w:fill="17365D"/>
+            <w:vAlign w:val="center"/>
           </w:tcPr>
           <w:p>
+            <w:pPr>
+              <w:spacing w:after="20"/>
+            </w:pPr>
             <w:r>
               <w:rPr>
                 <w:b/>
+                <w:color w:val="FFFFFF"/>
               </w:rPr>
-              <w:t>Expected behavior</w:t>
-            </w:r>
-          </w:p>
-        </w:tc>
-        <w:tc>
-          <w:tcPr>
-            <w:tcW w:w="3312" w:type="dxa"/>
-          </w:tcPr>
-          <w:p>
-            <w:r>
-              <w:rPr>
-                <w:b/>
-              </w:rPr>
-              <w:t>Recorded result</w:t>
+              <w:t>Observed result</w:t>
             </w:r>
           </w:p>
         </w:tc>
@@ -413,31 +1171,36 @@
       <w:tr>
         <w:tc>
           <w:tcPr>
-            <w:tcW w:w="3312" w:type="dxa"/>
+            <w:tcW w:w="4968" w:type="dxa"/>
+            <w:vAlign w:val="center"/>
           </w:tcPr>
           <w:p>
+            <w:pPr>
+              <w:spacing w:after="20"/>
+            </w:pPr>
             <w:r>
-              <w:t>URL request</w:t>
+              <w:rPr>
+                <w:b/>
+                <w:sz w:val="18"/>
+              </w:rPr>
+              <w:t>Target</w:t>
             </w:r>
           </w:p>
         </w:tc>
         <w:tc>
           <w:tcPr>
-            <w:tcW w:w="3312" w:type="dxa"/>
+            <w:tcW w:w="4968" w:type="dxa"/>
+            <w:vAlign w:val="center"/>
           </w:tcPr>
           <w:p>
+            <w:pPr>
+              <w:spacing w:after="20"/>
+            </w:pPr>
             <w:r>
-              <w:t>Record response status or a request error</w:t>
-            </w:r>
-          </w:p>
-        </w:tc>
-        <w:tc>
-          <w:tcPr>
-            <w:tcW w:w="3312" w:type="dxa"/>
-          </w:tcPr>
-          <w:p>
-            <w:r>
-              <w:t>Completed; HTTP 200</w:t>
+              <w:rPr>
+                <w:sz w:val="18"/>
+              </w:rPr>
+              <w:t>https://example.com</w:t>
             </w:r>
           </w:p>
         </w:tc>
@@ -445,31 +1208,36 @@
       <w:tr>
         <w:tc>
           <w:tcPr>
-            <w:tcW w:w="3312" w:type="dxa"/>
+            <w:tcW w:w="4968" w:type="dxa"/>
+            <w:vAlign w:val="center"/>
           </w:tcPr>
           <w:p>
+            <w:pPr>
+              <w:spacing w:after="20"/>
+            </w:pPr>
             <w:r>
-              <w:t>Finding summary</w:t>
+              <w:rPr>
+                <w:b/>
+                <w:sz w:val="18"/>
+              </w:rPr>
+              <w:t>Scan status</w:t>
             </w:r>
           </w:p>
         </w:tc>
         <w:tc>
           <w:tcPr>
-            <w:tcW w:w="3312" w:type="dxa"/>
+            <w:tcW w:w="4968" w:type="dxa"/>
+            <w:vAlign w:val="center"/>
           </w:tcPr>
           <w:p>
+            <w:pPr>
+              <w:spacing w:after="20"/>
+            </w:pPr>
             <w:r>
-              <w:t>Count findings by severity</w:t>
-            </w:r>
-          </w:p>
-        </w:tc>
-        <w:tc>
-          <w:tcPr>
-            <w:tcW w:w="3312" w:type="dxa"/>
-          </w:tcPr>
-          <w:p>
-            <w:r>
-              <w:t>7 total: High 2, Medium 2, Low 3, Info 0</w:t>
+              <w:rPr>
+                <w:sz w:val="18"/>
+              </w:rPr>
+              <w:t>completed</w:t>
             </w:r>
           </w:p>
         </w:tc>
@@ -477,31 +1245,888 @@
       <w:tr>
         <w:tc>
           <w:tcPr>
-            <w:tcW w:w="3312" w:type="dxa"/>
+            <w:tcW w:w="4968" w:type="dxa"/>
+            <w:vAlign w:val="center"/>
           </w:tcPr>
           <w:p>
+            <w:pPr>
+              <w:spacing w:after="20"/>
+            </w:pPr>
             <w:r>
-              <w:t>Report export</w:t>
+              <w:rPr>
+                <w:b/>
+                <w:sz w:val="18"/>
+              </w:rPr>
+              <w:t>HTTP status</w:t>
             </w:r>
           </w:p>
         </w:tc>
         <w:tc>
           <w:tcPr>
-            <w:tcW w:w="3312" w:type="dxa"/>
+            <w:tcW w:w="4968" w:type="dxa"/>
+            <w:vAlign w:val="center"/>
           </w:tcPr>
           <w:p>
+            <w:pPr>
+              <w:spacing w:after="20"/>
+            </w:pPr>
             <w:r>
-              <w:t>Save HTML and JSON reports</w:t>
+              <w:rPr>
+                <w:sz w:val="18"/>
+              </w:rPr>
+              <w:t>200</w:t>
+            </w:r>
+          </w:p>
+        </w:tc>
+      </w:tr>
+      <w:tr>
+        <w:tc>
+          <w:tcPr>
+            <w:tcW w:w="4968" w:type="dxa"/>
+            <w:vAlign w:val="center"/>
+          </w:tcPr>
+          <w:p>
+            <w:pPr>
+              <w:spacing w:after="20"/>
+            </w:pPr>
+            <w:r>
+              <w:rPr>
+                <w:b/>
+                <w:sz w:val="18"/>
+              </w:rPr>
+              <w:t>Total findings</w:t>
             </w:r>
           </w:p>
         </w:tc>
         <w:tc>
           <w:tcPr>
-            <w:tcW w:w="3312" w:type="dxa"/>
+            <w:tcW w:w="4968" w:type="dxa"/>
+            <w:vAlign w:val="center"/>
           </w:tcPr>
           <w:p>
+            <w:pPr>
+              <w:spacing w:after="20"/>
+            </w:pPr>
             <w:r>
-              <w:t>Both report files generated</w:t>
+              <w:rPr>
+                <w:sz w:val="18"/>
+              </w:rPr>
+              <w:t>7</w:t>
+            </w:r>
+          </w:p>
+        </w:tc>
+      </w:tr>
+      <w:tr>
+        <w:tc>
+          <w:tcPr>
+            <w:tcW w:w="4968" w:type="dxa"/>
+            <w:vAlign w:val="center"/>
+          </w:tcPr>
+          <w:p>
+            <w:pPr>
+              <w:spacing w:after="20"/>
+            </w:pPr>
+            <w:r>
+              <w:rPr>
+                <w:b/>
+                <w:sz w:val="18"/>
+              </w:rPr>
+              <w:t>High severity</w:t>
+            </w:r>
+          </w:p>
+        </w:tc>
+        <w:tc>
+          <w:tcPr>
+            <w:tcW w:w="4968" w:type="dxa"/>
+            <w:vAlign w:val="center"/>
+          </w:tcPr>
+          <w:p>
+            <w:pPr>
+              <w:spacing w:after="20"/>
+            </w:pPr>
+            <w:r>
+              <w:rPr>
+                <w:sz w:val="18"/>
+              </w:rPr>
+              <w:t>2</w:t>
+            </w:r>
+          </w:p>
+        </w:tc>
+      </w:tr>
+      <w:tr>
+        <w:tc>
+          <w:tcPr>
+            <w:tcW w:w="4968" w:type="dxa"/>
+            <w:vAlign w:val="center"/>
+          </w:tcPr>
+          <w:p>
+            <w:pPr>
+              <w:spacing w:after="20"/>
+            </w:pPr>
+            <w:r>
+              <w:rPr>
+                <w:b/>
+                <w:sz w:val="18"/>
+              </w:rPr>
+              <w:t>Medium severity</w:t>
+            </w:r>
+          </w:p>
+        </w:tc>
+        <w:tc>
+          <w:tcPr>
+            <w:tcW w:w="4968" w:type="dxa"/>
+            <w:vAlign w:val="center"/>
+          </w:tcPr>
+          <w:p>
+            <w:pPr>
+              <w:spacing w:after="20"/>
+            </w:pPr>
+            <w:r>
+              <w:rPr>
+                <w:sz w:val="18"/>
+              </w:rPr>
+              <w:t>2</w:t>
+            </w:r>
+          </w:p>
+        </w:tc>
+      </w:tr>
+      <w:tr>
+        <w:tc>
+          <w:tcPr>
+            <w:tcW w:w="4968" w:type="dxa"/>
+            <w:vAlign w:val="center"/>
+          </w:tcPr>
+          <w:p>
+            <w:pPr>
+              <w:spacing w:after="20"/>
+            </w:pPr>
+            <w:r>
+              <w:rPr>
+                <w:b/>
+                <w:sz w:val="18"/>
+              </w:rPr>
+              <w:t>Low severity</w:t>
+            </w:r>
+          </w:p>
+        </w:tc>
+        <w:tc>
+          <w:tcPr>
+            <w:tcW w:w="4968" w:type="dxa"/>
+            <w:vAlign w:val="center"/>
+          </w:tcPr>
+          <w:p>
+            <w:pPr>
+              <w:spacing w:after="20"/>
+            </w:pPr>
+            <w:r>
+              <w:rPr>
+                <w:sz w:val="18"/>
+              </w:rPr>
+              <w:t>3</w:t>
+            </w:r>
+          </w:p>
+        </w:tc>
+      </w:tr>
+      <w:tr>
+        <w:tc>
+          <w:tcPr>
+            <w:tcW w:w="4968" w:type="dxa"/>
+            <w:vAlign w:val="center"/>
+          </w:tcPr>
+          <w:p>
+            <w:pPr>
+              <w:spacing w:after="20"/>
+            </w:pPr>
+            <w:r>
+              <w:rPr>
+                <w:b/>
+                <w:sz w:val="18"/>
+              </w:rPr>
+              <w:t>Informational</w:t>
+            </w:r>
+          </w:p>
+        </w:tc>
+        <w:tc>
+          <w:tcPr>
+            <w:tcW w:w="4968" w:type="dxa"/>
+            <w:vAlign w:val="center"/>
+          </w:tcPr>
+          <w:p>
+            <w:pPr>
+              <w:spacing w:after="20"/>
+            </w:pPr>
+            <w:r>
+              <w:rPr>
+                <w:sz w:val="18"/>
+              </w:rPr>
+              <w:t>0</w:t>
+            </w:r>
+          </w:p>
+        </w:tc>
+      </w:tr>
+      <w:tr>
+        <w:tc>
+          <w:tcPr>
+            <w:tcW w:w="4968" w:type="dxa"/>
+            <w:vAlign w:val="center"/>
+          </w:tcPr>
+          <w:p>
+            <w:pPr>
+              <w:spacing w:after="20"/>
+            </w:pPr>
+            <w:r>
+              <w:rPr>
+                <w:b/>
+                <w:sz w:val="18"/>
+              </w:rPr>
+              <w:t>Files created</w:t>
+            </w:r>
+          </w:p>
+        </w:tc>
+        <w:tc>
+          <w:tcPr>
+            <w:tcW w:w="4968" w:type="dxa"/>
+            <w:vAlign w:val="center"/>
+          </w:tcPr>
+          <w:p>
+            <w:pPr>
+              <w:spacing w:after="20"/>
+            </w:pPr>
+            <w:r>
+              <w:rPr>
+                <w:sz w:val="18"/>
+              </w:rPr>
+              <w:t>demo_report.html and demo_report.json</w:t>
+            </w:r>
+          </w:p>
+        </w:tc>
+      </w:tr>
+    </w:tbl>
+    <w:p>
+      <w:pPr>
+        <w:pStyle w:val="Heading1"/>
+      </w:pPr>
+      <w:r>
+        <w:t>9. Findings in the Demonstration Report</w:t>
+      </w:r>
+    </w:p>
+    <w:p>
+      <w:r>
+        <w:t>The HTML report displayed the following observations. The scanner reports these as configuration signals; their practical importance depends on how the target application is designed and deployed.</w:t>
+      </w:r>
+    </w:p>
+    <w:tbl>
+      <w:tblPr>
+        <w:tblStyle w:val="TableGrid"/>
+        <w:tblW w:w="0" w:type="auto"/>
+        <w:jc w:val="center"/>
+        <w:tblLook w:val="04A0" w:firstRow="1" w:lastRow="0" w:firstColumn="1" w:lastColumn="0" w:noHBand="0" w:noVBand="1"/>
+      </w:tblPr>
+      <w:tblGrid>
+        <w:gridCol w:w="2484"/>
+        <w:gridCol w:w="2484"/>
+        <w:gridCol w:w="2484"/>
+        <w:gridCol w:w="2484"/>
+      </w:tblGrid>
+      <w:tr>
+        <w:trPr>
+          <w:jc w:val="center"/>
+        </w:trPr>
+        <w:tc>
+          <w:tcPr>
+            <w:tcW w:w="2484" w:type="dxa"/>
+            <w:shd w:val="clear" w:color="auto" w:fill="17365D"/>
+            <w:vAlign w:val="center"/>
+          </w:tcPr>
+          <w:p>
+            <w:pPr>
+              <w:spacing w:after="20"/>
+            </w:pPr>
+            <w:r>
+              <w:rPr>
+                <w:b/>
+                <w:color w:val="FFFFFF"/>
+                <w:sz w:val="16"/>
+              </w:rPr>
+              <w:t>Severity</w:t>
+            </w:r>
+          </w:p>
+        </w:tc>
+        <w:tc>
+          <w:tcPr>
+            <w:tcW w:w="2484" w:type="dxa"/>
+            <w:shd w:val="clear" w:color="auto" w:fill="17365D"/>
+            <w:vAlign w:val="center"/>
+          </w:tcPr>
+          <w:p>
+            <w:pPr>
+              <w:spacing w:after="20"/>
+            </w:pPr>
+            <w:r>
+              <w:rPr>
+                <w:b/>
+                <w:color w:val="FFFFFF"/>
+                <w:sz w:val="16"/>
+              </w:rPr>
+              <w:t>Finding</w:t>
+            </w:r>
+          </w:p>
+        </w:tc>
+        <w:tc>
+          <w:tcPr>
+            <w:tcW w:w="2484" w:type="dxa"/>
+            <w:shd w:val="clear" w:color="auto" w:fill="17365D"/>
+            <w:vAlign w:val="center"/>
+          </w:tcPr>
+          <w:p>
+            <w:pPr>
+              <w:spacing w:after="20"/>
+            </w:pPr>
+            <w:r>
+              <w:rPr>
+                <w:b/>
+                <w:color w:val="FFFFFF"/>
+                <w:sz w:val="16"/>
+              </w:rPr>
+              <w:t>Evidence shown</w:t>
+            </w:r>
+          </w:p>
+        </w:tc>
+        <w:tc>
+          <w:tcPr>
+            <w:tcW w:w="2484" w:type="dxa"/>
+            <w:shd w:val="clear" w:color="auto" w:fill="17365D"/>
+            <w:vAlign w:val="center"/>
+          </w:tcPr>
+          <w:p>
+            <w:pPr>
+              <w:spacing w:after="20"/>
+            </w:pPr>
+            <w:r>
+              <w:rPr>
+                <w:b/>
+                <w:color w:val="FFFFFF"/>
+                <w:sz w:val="16"/>
+              </w:rPr>
+              <w:t>Recommendation</w:t>
+            </w:r>
+          </w:p>
+        </w:tc>
+      </w:tr>
+      <w:tr>
+        <w:trPr>
+          <w:jc w:val="center"/>
+        </w:trPr>
+        <w:tc>
+          <w:tcPr>
+            <w:tcW w:w="2484" w:type="dxa"/>
+            <w:vAlign w:val="center"/>
+          </w:tcPr>
+          <w:p>
+            <w:pPr>
+              <w:spacing w:after="20"/>
+            </w:pPr>
+            <w:r>
+              <w:rPr>
+                <w:b/>
+                <w:sz w:val="15"/>
+              </w:rPr>
+              <w:t>High</w:t>
+            </w:r>
+          </w:p>
+        </w:tc>
+        <w:tc>
+          <w:tcPr>
+            <w:tcW w:w="2484" w:type="dxa"/>
+            <w:vAlign w:val="center"/>
+          </w:tcPr>
+          <w:p>
+            <w:pPr>
+              <w:spacing w:after="20"/>
+            </w:pPr>
+            <w:r>
+              <w:rPr>
+                <w:sz w:val="15"/>
+              </w:rPr>
+              <w:t>Missing Strict-Transport-Security</w:t>
+            </w:r>
+          </w:p>
+        </w:tc>
+        <w:tc>
+          <w:tcPr>
+            <w:tcW w:w="2484" w:type="dxa"/>
+            <w:vAlign w:val="center"/>
+          </w:tcPr>
+          <w:p>
+            <w:pPr>
+              <w:spacing w:after="20"/>
+            </w:pPr>
+            <w:r>
+              <w:rPr>
+                <w:sz w:val="15"/>
+              </w:rPr>
+              <w:t>The response did not include this header.</w:t>
+            </w:r>
+          </w:p>
+        </w:tc>
+        <w:tc>
+          <w:tcPr>
+            <w:tcW w:w="2484" w:type="dxa"/>
+            <w:vAlign w:val="center"/>
+          </w:tcPr>
+          <w:p>
+            <w:pPr>
+              <w:spacing w:after="20"/>
+            </w:pPr>
+            <w:r>
+              <w:rPr>
+                <w:sz w:val="15"/>
+              </w:rPr>
+              <w:t>For HTTPS deployments, review whether HSTS is appropriate and ensure required subdomains support HTTPS before enabling it.</w:t>
+            </w:r>
+          </w:p>
+        </w:tc>
+      </w:tr>
+      <w:tr>
+        <w:trPr>
+          <w:jc w:val="center"/>
+        </w:trPr>
+        <w:tc>
+          <w:tcPr>
+            <w:tcW w:w="2484" w:type="dxa"/>
+            <w:vAlign w:val="center"/>
+          </w:tcPr>
+          <w:p>
+            <w:pPr>
+              <w:spacing w:after="20"/>
+            </w:pPr>
+            <w:r>
+              <w:rPr>
+                <w:b/>
+                <w:sz w:val="15"/>
+              </w:rPr>
+              <w:t>High</w:t>
+            </w:r>
+          </w:p>
+        </w:tc>
+        <w:tc>
+          <w:tcPr>
+            <w:tcW w:w="2484" w:type="dxa"/>
+            <w:vAlign w:val="center"/>
+          </w:tcPr>
+          <w:p>
+            <w:pPr>
+              <w:spacing w:after="20"/>
+            </w:pPr>
+            <w:r>
+              <w:rPr>
+                <w:sz w:val="15"/>
+              </w:rPr>
+              <w:t>Missing Content-Security-Policy</w:t>
+            </w:r>
+          </w:p>
+        </w:tc>
+        <w:tc>
+          <w:tcPr>
+            <w:tcW w:w="2484" w:type="dxa"/>
+            <w:vAlign w:val="center"/>
+          </w:tcPr>
+          <w:p>
+            <w:pPr>
+              <w:spacing w:after="20"/>
+            </w:pPr>
+            <w:r>
+              <w:rPr>
+                <w:sz w:val="15"/>
+              </w:rPr>
+              <w:t>The response did not include this header.</w:t>
+            </w:r>
+          </w:p>
+        </w:tc>
+        <w:tc>
+          <w:tcPr>
+            <w:tcW w:w="2484" w:type="dxa"/>
+            <w:vAlign w:val="center"/>
+          </w:tcPr>
+          <w:p>
+            <w:pPr>
+              <w:spacing w:after="20"/>
+            </w:pPr>
+            <w:r>
+              <w:rPr>
+                <w:sz w:val="15"/>
+              </w:rPr>
+              <w:t>Define a policy suited to the application; consider report-only mode while validating compatibility.</w:t>
+            </w:r>
+          </w:p>
+        </w:tc>
+      </w:tr>
+      <w:tr>
+        <w:trPr>
+          <w:jc w:val="center"/>
+        </w:trPr>
+        <w:tc>
+          <w:tcPr>
+            <w:tcW w:w="2484" w:type="dxa"/>
+            <w:vAlign w:val="center"/>
+          </w:tcPr>
+          <w:p>
+            <w:pPr>
+              <w:spacing w:after="20"/>
+            </w:pPr>
+            <w:r>
+              <w:rPr>
+                <w:b/>
+                <w:sz w:val="15"/>
+              </w:rPr>
+              <w:t>Medium</w:t>
+            </w:r>
+          </w:p>
+        </w:tc>
+        <w:tc>
+          <w:tcPr>
+            <w:tcW w:w="2484" w:type="dxa"/>
+            <w:vAlign w:val="center"/>
+          </w:tcPr>
+          <w:p>
+            <w:pPr>
+              <w:spacing w:after="20"/>
+            </w:pPr>
+            <w:r>
+              <w:rPr>
+                <w:sz w:val="15"/>
+              </w:rPr>
+              <w:t>Missing X-Content-Type-Options</w:t>
+            </w:r>
+          </w:p>
+        </w:tc>
+        <w:tc>
+          <w:tcPr>
+            <w:tcW w:w="2484" w:type="dxa"/>
+            <w:vAlign w:val="center"/>
+          </w:tcPr>
+          <w:p>
+            <w:pPr>
+              <w:spacing w:after="20"/>
+            </w:pPr>
+            <w:r>
+              <w:rPr>
+                <w:sz w:val="15"/>
+              </w:rPr>
+              <w:t>The response did not include this header.</w:t>
+            </w:r>
+          </w:p>
+        </w:tc>
+        <w:tc>
+          <w:tcPr>
+            <w:tcW w:w="2484" w:type="dxa"/>
+            <w:vAlign w:val="center"/>
+          </w:tcPr>
+          <w:p>
+            <w:pPr>
+              <w:spacing w:after="20"/>
+            </w:pPr>
+            <w:r>
+              <w:rPr>
+                <w:sz w:val="15"/>
+              </w:rPr>
+              <w:t>Review setting X-Content-Type-Options to nosniff.</w:t>
+            </w:r>
+          </w:p>
+        </w:tc>
+      </w:tr>
+      <w:tr>
+        <w:trPr>
+          <w:jc w:val="center"/>
+        </w:trPr>
+        <w:tc>
+          <w:tcPr>
+            <w:tcW w:w="2484" w:type="dxa"/>
+            <w:vAlign w:val="center"/>
+          </w:tcPr>
+          <w:p>
+            <w:pPr>
+              <w:spacing w:after="20"/>
+            </w:pPr>
+            <w:r>
+              <w:rPr>
+                <w:b/>
+                <w:sz w:val="15"/>
+              </w:rPr>
+              <w:t>Medium</w:t>
+            </w:r>
+          </w:p>
+        </w:tc>
+        <w:tc>
+          <w:tcPr>
+            <w:tcW w:w="2484" w:type="dxa"/>
+            <w:vAlign w:val="center"/>
+          </w:tcPr>
+          <w:p>
+            <w:pPr>
+              <w:spacing w:after="20"/>
+            </w:pPr>
+            <w:r>
+              <w:rPr>
+                <w:sz w:val="15"/>
+              </w:rPr>
+              <w:t>Missing X-Frame-Options</w:t>
+            </w:r>
+          </w:p>
+        </w:tc>
+        <w:tc>
+          <w:tcPr>
+            <w:tcW w:w="2484" w:type="dxa"/>
+            <w:vAlign w:val="center"/>
+          </w:tcPr>
+          <w:p>
+            <w:pPr>
+              <w:spacing w:after="20"/>
+            </w:pPr>
+            <w:r>
+              <w:rPr>
+                <w:sz w:val="15"/>
+              </w:rPr>
+              <w:t>The response did not include this header.</w:t>
+            </w:r>
+          </w:p>
+        </w:tc>
+        <w:tc>
+          <w:tcPr>
+            <w:tcW w:w="2484" w:type="dxa"/>
+            <w:vAlign w:val="center"/>
+          </w:tcPr>
+          <w:p>
+            <w:pPr>
+              <w:spacing w:after="20"/>
+            </w:pPr>
+            <w:r>
+              <w:rPr>
+                <w:sz w:val="15"/>
+              </w:rPr>
+              <w:t>Review DENY or SAMEORIGIN, or an appropriate CSP frame-ancestors directive.</w:t>
+            </w:r>
+          </w:p>
+        </w:tc>
+      </w:tr>
+      <w:tr>
+        <w:trPr>
+          <w:jc w:val="center"/>
+        </w:trPr>
+        <w:tc>
+          <w:tcPr>
+            <w:tcW w:w="2484" w:type="dxa"/>
+            <w:vAlign w:val="center"/>
+          </w:tcPr>
+          <w:p>
+            <w:pPr>
+              <w:spacing w:after="20"/>
+            </w:pPr>
+            <w:r>
+              <w:rPr>
+                <w:b/>
+                <w:sz w:val="15"/>
+              </w:rPr>
+              <w:t>Low</w:t>
+            </w:r>
+          </w:p>
+        </w:tc>
+        <w:tc>
+          <w:tcPr>
+            <w:tcW w:w="2484" w:type="dxa"/>
+            <w:vAlign w:val="center"/>
+          </w:tcPr>
+          <w:p>
+            <w:pPr>
+              <w:spacing w:after="20"/>
+            </w:pPr>
+            <w:r>
+              <w:rPr>
+                <w:sz w:val="15"/>
+              </w:rPr>
+              <w:t>Missing Referrer-Policy</w:t>
+            </w:r>
+          </w:p>
+        </w:tc>
+        <w:tc>
+          <w:tcPr>
+            <w:tcW w:w="2484" w:type="dxa"/>
+            <w:vAlign w:val="center"/>
+          </w:tcPr>
+          <w:p>
+            <w:pPr>
+              <w:spacing w:after="20"/>
+            </w:pPr>
+            <w:r>
+              <w:rPr>
+                <w:sz w:val="15"/>
+              </w:rPr>
+              <w:t>The response did not include this header.</w:t>
+            </w:r>
+          </w:p>
+        </w:tc>
+        <w:tc>
+          <w:tcPr>
+            <w:tcW w:w="2484" w:type="dxa"/>
+            <w:vAlign w:val="center"/>
+          </w:tcPr>
+          <w:p>
+            <w:pPr>
+              <w:spacing w:after="20"/>
+            </w:pPr>
+            <w:r>
+              <w:rPr>
+                <w:sz w:val="15"/>
+              </w:rPr>
+              <w:t>Choose a referrer policy that fits the site’s privacy and functionality requirements.</w:t>
+            </w:r>
+          </w:p>
+        </w:tc>
+      </w:tr>
+      <w:tr>
+        <w:trPr>
+          <w:jc w:val="center"/>
+        </w:trPr>
+        <w:tc>
+          <w:tcPr>
+            <w:tcW w:w="2484" w:type="dxa"/>
+            <w:vAlign w:val="center"/>
+          </w:tcPr>
+          <w:p>
+            <w:pPr>
+              <w:spacing w:after="20"/>
+            </w:pPr>
+            <w:r>
+              <w:rPr>
+                <w:b/>
+                <w:sz w:val="15"/>
+              </w:rPr>
+              <w:t>Low</w:t>
+            </w:r>
+          </w:p>
+        </w:tc>
+        <w:tc>
+          <w:tcPr>
+            <w:tcW w:w="2484" w:type="dxa"/>
+            <w:vAlign w:val="center"/>
+          </w:tcPr>
+          <w:p>
+            <w:pPr>
+              <w:spacing w:after="20"/>
+            </w:pPr>
+            <w:r>
+              <w:rPr>
+                <w:sz w:val="15"/>
+              </w:rPr>
+              <w:t>Missing Permissions-Policy</w:t>
+            </w:r>
+          </w:p>
+        </w:tc>
+        <w:tc>
+          <w:tcPr>
+            <w:tcW w:w="2484" w:type="dxa"/>
+            <w:vAlign w:val="center"/>
+          </w:tcPr>
+          <w:p>
+            <w:pPr>
+              <w:spacing w:after="20"/>
+            </w:pPr>
+            <w:r>
+              <w:rPr>
+                <w:sz w:val="15"/>
+              </w:rPr>
+              <w:t>The response did not include this header.</w:t>
+            </w:r>
+          </w:p>
+        </w:tc>
+        <w:tc>
+          <w:tcPr>
+            <w:tcW w:w="2484" w:type="dxa"/>
+            <w:vAlign w:val="center"/>
+          </w:tcPr>
+          <w:p>
+            <w:pPr>
+              <w:spacing w:after="20"/>
+            </w:pPr>
+            <w:r>
+              <w:rPr>
+                <w:sz w:val="15"/>
+              </w:rPr>
+              <w:t>Consider disabling browser features that the application does not need.</w:t>
+            </w:r>
+          </w:p>
+        </w:tc>
+      </w:tr>
+      <w:tr>
+        <w:trPr>
+          <w:jc w:val="center"/>
+        </w:trPr>
+        <w:tc>
+          <w:tcPr>
+            <w:tcW w:w="2484" w:type="dxa"/>
+            <w:vAlign w:val="center"/>
+          </w:tcPr>
+          <w:p>
+            <w:pPr>
+              <w:spacing w:after="20"/>
+            </w:pPr>
+            <w:r>
+              <w:rPr>
+                <w:b/>
+                <w:sz w:val="15"/>
+              </w:rPr>
+              <w:t>Low</w:t>
+            </w:r>
+          </w:p>
+        </w:tc>
+        <w:tc>
+          <w:tcPr>
+            <w:tcW w:w="2484" w:type="dxa"/>
+            <w:vAlign w:val="center"/>
+          </w:tcPr>
+          <w:p>
+            <w:pPr>
+              <w:spacing w:after="20"/>
+            </w:pPr>
+            <w:r>
+              <w:rPr>
+                <w:sz w:val="15"/>
+              </w:rPr>
+              <w:t>Server header disclosed</w:t>
+            </w:r>
+          </w:p>
+        </w:tc>
+        <w:tc>
+          <w:tcPr>
+            <w:tcW w:w="2484" w:type="dxa"/>
+            <w:vAlign w:val="center"/>
+          </w:tcPr>
+          <w:p>
+            <w:pPr>
+              <w:spacing w:after="20"/>
+            </w:pPr>
+            <w:r>
+              <w:rPr>
+                <w:sz w:val="15"/>
+              </w:rPr>
+              <w:t>The report showed the server header value as cloudflare.</w:t>
+            </w:r>
+          </w:p>
+        </w:tc>
+        <w:tc>
+          <w:tcPr>
+            <w:tcW w:w="2484" w:type="dxa"/>
+            <w:vAlign w:val="center"/>
+          </w:tcPr>
+          <w:p>
+            <w:pPr>
+              <w:spacing w:after="20"/>
+            </w:pPr>
+            <w:r>
+              <w:rPr>
+                <w:sz w:val="15"/>
+              </w:rPr>
+              <w:t>Review whether the disclosed server information is necessary; avoid assuming that this alone is a vulnerability.</w:t>
             </w:r>
           </w:p>
         </w:tc>
@@ -509,7 +2134,7 @@
     </w:tbl>
     <w:p>
       <w:r>
-        <w:t>The results above describe one recorded run and may change if the website response changes. Missing headers are configuration observations, not proof of an exploitable vulnerability.</w:t>
+        <w:t>Severity labels are the scanner’s own prioritization for these checks, not a verified risk rating from a penetration test. Missing headers alone do not prove an exploitable weakness.</w:t>
       </w:r>
     </w:p>
     <w:p>
@@ -517,154 +2142,289 @@
         <w:pStyle w:val="Heading1"/>
       </w:pPr>
       <w:r>
-        <w:t>9. Dataset</w:t>
+        <w:t>10. Screenshots and Evidence</w:t>
+      </w:r>
+    </w:p>
+    <w:p>
+      <w:pPr>
+        <w:pStyle w:val="Heading2"/>
+      </w:pPr>
+      <w:r>
+        <w:t>Figure 1. Source code and successful terminal execution</w:t>
       </w:r>
     </w:p>
     <w:p>
       <w:r>
-        <w:t>No dataset is used or required. This project is rule-based and does not train a machine-learning model. The URL is runtime input. Therefore, a dataset download link is not applicable.</w:t>
+        <w:t>This screenshot shows the Python project open in Visual Studio Code and the successful command-line run. The terminal reports status completed, HTTP status 200, seven findings, and creation of the HTML and JSON reports.</w:t>
       </w:r>
     </w:p>
     <w:p>
       <w:pPr>
-        <w:pStyle w:val="Heading1"/>
+        <w:jc w:val="center"/>
       </w:pPr>
       <w:r>
-        <w:t>10. Scope and Limitations</w:t>
+        <w:rPr>
+          <w:noProof/>
+        </w:rPr>
+        <w:lastRenderedPageBreak/>
+        <w:drawing>
+          <wp:inline distT="0" distB="0" distL="0" distR="0" wp14:anchorId="61C95A86" wp14:editId="04A2AD69">
+            <wp:extent cx="5943600" cy="3062137"/>
+            <wp:effectExtent l="0" t="0" r="0" b="0"/>
+            <wp:docPr id="1" name="Picture 1"/>
+            <wp:cNvGraphicFramePr>
+              <a:graphicFrameLocks xmlns:a="http://schemas.openxmlformats.org/drawingml/2006/main" noChangeAspect="1"/>
+            </wp:cNvGraphicFramePr>
+            <a:graphic xmlns:a="http://schemas.openxmlformats.org/drawingml/2006/main">
+              <a:graphicData uri="http://schemas.openxmlformats.org/drawingml/2006/picture">
+                <pic:pic xmlns:pic="http://schemas.openxmlformats.org/drawingml/2006/picture">
+                  <pic:nvPicPr>
+                    <pic:cNvPr id="0" name="image(20261023-111213).png"/>
+                    <pic:cNvPicPr/>
+                  </pic:nvPicPr>
+                  <pic:blipFill>
+                    <a:blip r:embed="rId8"/>
+                    <a:stretch>
+                      <a:fillRect/>
+                    </a:stretch>
+                  </pic:blipFill>
+                  <pic:spPr>
+                    <a:xfrm>
+                      <a:off x="0" y="0"/>
+                      <a:ext cx="5943600" cy="3062137"/>
+                    </a:xfrm>
+                    <a:prstGeom prst="rect">
+                      <a:avLst/>
+                    </a:prstGeom>
+                  </pic:spPr>
+                </pic:pic>
+              </a:graphicData>
+            </a:graphic>
+          </wp:inline>
+        </w:drawing>
       </w:r>
     </w:p>
     <w:p>
       <w:pPr>
-        <w:pStyle w:val="ListBullet"/>
+        <w:jc w:val="center"/>
       </w:pPr>
       <w:r>
-        <w:t>Reviews only a limited set of response configuration signals.</w:t>
+        <w:rPr>
+          <w:i/>
+          <w:sz w:val="16"/>
+        </w:rPr>
+        <w:t>Figure 1. Scanner source and terminal output.</w:t>
       </w:r>
     </w:p>
     <w:p>
       <w:pPr>
-        <w:pStyle w:val="ListBullet"/>
+        <w:pStyle w:val="Heading2"/>
       </w:pPr>
       <w:r>
-        <w:t>Does not exploit issues, brute-force, crawl, or run intrusive tests.</w:t>
-      </w:r>
-    </w:p>
-    <w:p>
-      <w:pPr>
-        <w:pStyle w:val="ListBullet"/>
-      </w:pPr>
-      <w:r>
-        <w:t>Does not test authentication, authorization, business logic, injection vulnerabilities, or all OWASP risks.</w:t>
-      </w:r>
-    </w:p>
-    <w:p>
-      <w:pPr>
-        <w:pStyle w:val="ListBullet"/>
-      </w:pPr>
-      <w:r>
-        <w:t>A header being present does not prove that its value is configured correctly.</w:t>
-      </w:r>
-    </w:p>
-    <w:p>
-      <w:pPr>
-        <w:pStyle w:val="ListBullet"/>
-      </w:pPr>
-      <w:r>
-        <w:t>A missing header does not automatically establish a vulnerability.</w:t>
-      </w:r>
-    </w:p>
-    <w:p>
-      <w:pPr>
-        <w:pStyle w:val="ListBullet"/>
-      </w:pPr>
-      <w:r>
-        <w:t>Only scan websites you own or have explicit permission to assess.</w:t>
-      </w:r>
-    </w:p>
-    <w:p>
-      <w:pPr>
-        <w:pStyle w:val="Heading1"/>
-      </w:pPr>
-      <w:r>
-        <w:t>11. Future Enhancements</w:t>
-      </w:r>
-    </w:p>
-    <w:p>
-      <w:pPr>
-        <w:pStyle w:val="ListBullet"/>
-      </w:pPr>
-      <w:r>
-        <w:t>Add unit tests using a local mock HTTP server.</w:t>
-      </w:r>
-    </w:p>
-    <w:p>
-      <w:pPr>
-        <w:pStyle w:val="ListBullet"/>
-      </w:pPr>
-      <w:r>
-        <w:t>Add a comparison view for reports from multiple scan dates.</w:t>
-      </w:r>
-    </w:p>
-    <w:p>
-      <w:pPr>
-        <w:pStyle w:val="ListBullet"/>
-      </w:pPr>
-      <w:r>
-        <w:t>Improve report formatting for narrow browser windows.</w:t>
-      </w:r>
-    </w:p>
-    <w:p>
-      <w:pPr>
-        <w:pStyle w:val="ListBullet"/>
-      </w:pPr>
-      <w:r>
-        <w:t>Expand checks with careful validation and appropriate authorization.</w:t>
-      </w:r>
-    </w:p>
-    <w:p>
-      <w:pPr>
-        <w:pStyle w:val="Heading1"/>
-      </w:pPr>
-      <w:r>
-        <w:lastRenderedPageBreak/>
-        <w:t>12. Conclusion</w:t>
+        <w:t>Figure 2. Generated HTML report</w:t>
       </w:r>
     </w:p>
     <w:p>
       <w:r>
-        <w:t>The project demonstrates how Python can automate a basic review of selected web security configuration signals. It generates reports that help users identify settings for further review. It is an educational tool and should not be treated as a complete security audit or a guarantee that a website is secure.</w:t>
+        <w:t>This screenshot shows the report rendered in a web browser. It includes the target URL, scan time, status, final URL, severity summary, findings table, and scope/limitations note.</w:t>
       </w:r>
     </w:p>
     <w:p>
       <w:pPr>
+        <w:jc w:val="center"/>
+      </w:pPr>
+      <w:r>
+        <w:rPr>
+          <w:noProof/>
+        </w:rPr>
+        <w:drawing>
+          <wp:inline distT="0" distB="0" distL="0" distR="0" wp14:anchorId="6FE349BE" wp14:editId="7D90EB7E">
+            <wp:extent cx="5943600" cy="3051360"/>
+            <wp:effectExtent l="0" t="0" r="0" b="0"/>
+            <wp:docPr id="2" name="Picture 2"/>
+            <wp:cNvGraphicFramePr>
+              <a:graphicFrameLocks xmlns:a="http://schemas.openxmlformats.org/drawingml/2006/main" noChangeAspect="1"/>
+            </wp:cNvGraphicFramePr>
+            <a:graphic xmlns:a="http://schemas.openxmlformats.org/drawingml/2006/main">
+              <a:graphicData uri="http://schemas.openxmlformats.org/drawingml/2006/picture">
+                <pic:pic xmlns:pic="http://schemas.openxmlformats.org/drawingml/2006/picture">
+                  <pic:nvPicPr>
+                    <pic:cNvPr id="0" name="image(20261023-111252).png"/>
+                    <pic:cNvPicPr/>
+                  </pic:nvPicPr>
+                  <pic:blipFill>
+                    <a:blip r:embed="rId9"/>
+                    <a:stretch>
+                      <a:fillRect/>
+                    </a:stretch>
+                  </pic:blipFill>
+                  <pic:spPr>
+                    <a:xfrm>
+                      <a:off x="0" y="0"/>
+                      <a:ext cx="5943600" cy="3051360"/>
+                    </a:xfrm>
+                    <a:prstGeom prst="rect">
+                      <a:avLst/>
+                    </a:prstGeom>
+                  </pic:spPr>
+                </pic:pic>
+              </a:graphicData>
+            </a:graphic>
+          </wp:inline>
+        </w:drawing>
+      </w:r>
+    </w:p>
+    <w:p>
+      <w:pPr>
+        <w:jc w:val="center"/>
+      </w:pPr>
+      <w:r>
+        <w:rPr>
+          <w:i/>
+          <w:sz w:val="16"/>
+        </w:rPr>
+        <w:t>Figure 2. HTML report generated by the scanner.</w:t>
+      </w:r>
+    </w:p>
+    <w:p>
+      <w:pPr>
         <w:pStyle w:val="Heading1"/>
       </w:pPr>
       <w:r>
-        <w:t>13. References</w:t>
+        <w:t>11. Output Files</w:t>
+      </w:r>
+    </w:p>
+    <w:p>
+      <w:pPr>
+        <w:pStyle w:val="ListBullet"/>
+      </w:pPr>
+      <w:r>
+        <w:t>Brithi_Automated_Web_Security_Scanner.py — source code for the scanner.</w:t>
+      </w:r>
+    </w:p>
+    <w:p>
+      <w:pPr>
+        <w:pStyle w:val="ListBullet"/>
+      </w:pPr>
+      <w:r>
+        <w:t>requirements.txt — Python package dependencies required to run the code.</w:t>
+      </w:r>
+    </w:p>
+    <w:p>
+      <w:pPr>
+        <w:pStyle w:val="ListBullet"/>
+      </w:pPr>
+      <w:r>
+        <w:t>README.md — project overview, setup instructions, usage, and limitations.</w:t>
+      </w:r>
+    </w:p>
+    <w:p>
+      <w:pPr>
+        <w:pStyle w:val="ListBullet"/>
+      </w:pPr>
+      <w:r>
+        <w:t>Brithi_ProjectReport_Updated.docx — this project report with screenshots.</w:t>
+      </w:r>
+    </w:p>
+    <w:p>
+      <w:pPr>
+        <w:pStyle w:val="ListBullet"/>
+      </w:pPr>
+      <w:r>
+        <w:lastRenderedPageBreak/>
+        <w:t>demo_report.html — browser-readable output from the demonstration run.</w:t>
+      </w:r>
+    </w:p>
+    <w:p>
+      <w:pPr>
+        <w:pStyle w:val="ListBullet"/>
+      </w:pPr>
+      <w:r>
+        <w:t>demo_report.json — structured output from the demonstration run.</w:t>
+      </w:r>
+    </w:p>
+    <w:p>
+      <w:pPr>
+        <w:pStyle w:val="Heading1"/>
+      </w:pPr>
+      <w:r>
+        <w:t>12. Conclusion and Future Enhancements</w:t>
       </w:r>
     </w:p>
     <w:p>
       <w:r>
-        <w:t>OWASP Secure Headers Project: https://owasp.org/www-project-secure-headers/</w:t>
+        <w:t>The project demonstrates a practical Python workflow: accepting a URL, retrieving response metadata, checking selected security headers, assigning severity labels, and generating HTML and JSON reports. The successful example run confirms that the current implementation can complete a scan and create output files in the demonstrated environment.</w:t>
       </w:r>
     </w:p>
     <w:p>
       <w:r>
-        <w:t>Requests documentation: https://requests.readthedocs.io/</w:t>
+        <w:t>Possible future improvements include:</w:t>
+      </w:r>
+    </w:p>
+    <w:p>
+      <w:pPr>
+        <w:pStyle w:val="ListBullet"/>
+      </w:pPr>
+      <w:r>
+        <w:t>Add unit tests for header checks, severity counts, URL validation, and report generation.</w:t>
+      </w:r>
+    </w:p>
+    <w:p>
+      <w:pPr>
+        <w:pStyle w:val="ListBullet"/>
+      </w:pPr>
+      <w:r>
+        <w:t>Add clearer error handling for timeouts, invalid URLs, TLS errors, and unreachable hosts.</w:t>
+      </w:r>
+    </w:p>
+    <w:p>
+      <w:pPr>
+        <w:pStyle w:val="ListBullet"/>
+      </w:pPr>
+      <w:r>
+        <w:t>Include a scan configuration option so checks and severities can be reviewed transparently.</w:t>
+      </w:r>
+    </w:p>
+    <w:p>
+      <w:pPr>
+        <w:pStyle w:val="ListBullet"/>
+      </w:pPr>
+      <w:r>
+        <w:t>Improve HTML accessibility and responsive layout for small screens.</w:t>
+      </w:r>
+    </w:p>
+    <w:p>
+      <w:pPr>
+        <w:pStyle w:val="ListBullet"/>
+      </w:pPr>
+      <w:r>
+        <w:t>Add timestamps, scanner version, and a clear distinction between missing headers and confirmed vulnerabilities.</w:t>
+      </w:r>
+    </w:p>
+    <w:p>
+      <w:pPr>
+        <w:pStyle w:val="ListBullet"/>
+      </w:pPr>
+      <w:r>
+        <w:t>Test only with explicitly authorized targets and document the scope for each demonstration.</w:t>
+      </w:r>
+    </w:p>
+    <w:p>
+      <w:pPr>
+        <w:pStyle w:val="Heading1"/>
+      </w:pPr>
+      <w:r>
+        <w:t>13. References and Usage Note</w:t>
       </w:r>
     </w:p>
     <w:p>
       <w:r>
-        <w:rPr>
-          <w:b/>
-        </w:rPr>
-        <w:t xml:space="preserve">Before submission: </w:t>
-      </w:r>
-      <w:r>
-        <w:t>Check the student name, attach genuine screenshots if requested, and ensure the code filename matches the organizer's naming convention.</w:t>
+        <w:t>This report is based on the project behavior and screenshots supplied for the demonstration. It does not claim an independent penetration test or external verification of the target. For real deployments, validate each recommendation against the application’s requirements and current browser/server documentation.</w:t>
       </w:r>
     </w:p>
     <w:sectPr>
+      <w:headerReference w:type="default" r:id="rId10"/>
+      <w:footerReference w:type="default" r:id="rId11"/>
       <w:pgSz w:w="12240" w:h="15840"/>
       <w:pgMar w:top="1008" w:right="1152" w:bottom="1008" w:left="1152" w:header="720" w:footer="720" w:gutter="0"/>
       <w:cols w:space="720"/>
@@ -672,6 +2432,107 @@
     </w:sectPr>
   </w:body>
 </w:document>
+</file>
+
+<file path=word/endnotes.xml><?xml version="1.0" encoding="utf-8"?>
+<w:endnotes xmlns:wpc="http://schemas.microsoft.com/office/word/2010/wordprocessingCanvas" xmlns:cx="http://schemas.microsoft.com/office/drawing/2014/chartex" xmlns:cx1="http://schemas.microsoft.com/office/drawing/2015/9/8/chartex" xmlns:cx2="http://schemas.microsoft.com/office/drawing/2015/10/21/chartex" xmlns:cx3="http://schemas.microsoft.com/office/drawing/2016/5/9/chartex" xmlns:cx4="http://schemas.microsoft.com/office/drawing/2016/5/10/chartex" xmlns:cx5="http://schemas.microsoft.com/office/drawing/2016/5/11/chartex" xmlns:cx6="http://schemas.microsoft.com/office/drawing/2016/5/12/chartex" xmlns:cx7="http://schemas.microsoft.com/office/drawing/2016/5/13/chartex" xmlns:cx8="http://schemas.microsoft.com/office/drawing/2016/5/14/chartex" xmlns:mc="http://schemas.openxmlformats.org/markup-compatibility/2006" xmlns:aink="http://schemas.microsoft.com/office/drawing/2016/ink" xmlns:am3d="http://schemas.microsoft.com/office/drawing/2017/model3d" xmlns:o="urn:schemas-microsoft-com:office:office" xmlns:oel="http://schemas.microsoft.com/office/2019/extlst" xmlns:r="http://schemas.openxmlformats.org/officeDocument/2006/relationships" xmlns:m="http://schemas.openxmlformats.org/officeDocument/2006/math" xmlns:v="urn:schemas-microsoft-com:vml" xmlns:wp14="http://schemas.microsoft.com/office/word/2010/wordprocessingDrawing" xmlns:wp="http://schemas.openxmlformats.org/drawingml/2006/wordprocessingDrawing" xmlns:w10="urn:schemas-microsoft-com:office:word" xmlns:w="http://schemas.openxmlformats.org/wordprocessingml/2006/main" xmlns:w14="http://schemas.microsoft.com/office/word/2010/wordml" xmlns:w15="http://schemas.microsoft.com/office/word/2012/wordml" xmlns:w16cex="http://schemas.microsoft.com/office/word/2018/wordml/cex" xmlns:w16cid="http://schemas.microsoft.com/office/word/2016/wordml/cid" xmlns:w16="http://schemas.microsoft.com/office/word/2018/wordml" xmlns:w16du="http://schemas.microsoft.com/office/word/2023/wordml/word16du" xmlns:w16sdtdh="http://schemas.microsoft.com/office/word/2020/wordml/sdtdatahash" xmlns:w16sdtfl="http://schemas.microsoft.com/office/word/2024/wordml/sdtformatlock" xmlns:w16se="http://schemas.microsoft.com/office/word/2015/wordml/symex" xmlns:wpg="http://schemas.microsoft.com/office/word/2010/wordprocessingGroup" xmlns:wpi="http://schemas.microsoft.com/office/word/2010/wordprocessingInk" xmlns:wne="http://schemas.microsoft.com/office/word/2006/wordml" xmlns:wps="http://schemas.microsoft.com/office/word/2010/wordprocessingShape" mc:Ignorable="w14 w15 w16se w16cid w16 w16cex w16sdtdh w16sdtfl w16du wp14">
+  <w:endnote w:type="separator" w:id="-1">
+    <w:p>
+      <w:pPr>
+        <w:spacing w:after="0" w:line="240" w:lineRule="auto"/>
+      </w:pPr>
+      <w:r>
+        <w:separator/>
+      </w:r>
+    </w:p>
+  </w:endnote>
+  <w:endnote w:type="continuationSeparator" w:id="0">
+    <w:p>
+      <w:pPr>
+        <w:spacing w:after="0" w:line="240" w:lineRule="auto"/>
+      </w:pPr>
+      <w:r>
+        <w:continuationSeparator/>
+      </w:r>
+    </w:p>
+  </w:endnote>
+</w:endnotes>
+</file>
+
+<file path=word/footer1.xml><?xml version="1.0" encoding="utf-8"?>
+<w:ftr xmlns:wpc="http://schemas.microsoft.com/office/word/2010/wordprocessingCanvas" xmlns:cx="http://schemas.microsoft.com/office/drawing/2014/chartex" xmlns:cx1="http://schemas.microsoft.com/office/drawing/2015/9/8/chartex" xmlns:cx2="http://schemas.microsoft.com/office/drawing/2015/10/21/chartex" xmlns:cx3="http://schemas.microsoft.com/office/drawing/2016/5/9/chartex" xmlns:cx4="http://schemas.microsoft.com/office/drawing/2016/5/10/chartex" xmlns:cx5="http://schemas.microsoft.com/office/drawing/2016/5/11/chartex" xmlns:cx6="http://schemas.microsoft.com/office/drawing/2016/5/12/chartex" xmlns:cx7="http://schemas.microsoft.com/office/drawing/2016/5/13/chartex" xmlns:cx8="http://schemas.microsoft.com/office/drawing/2016/5/14/chartex" xmlns:mc="http://schemas.openxmlformats.org/markup-compatibility/2006" xmlns:aink="http://schemas.microsoft.com/office/drawing/2016/ink" xmlns:am3d="http://schemas.microsoft.com/office/drawing/2017/model3d" xmlns:o="urn:schemas-microsoft-com:office:office" xmlns:oel="http://schemas.microsoft.com/office/2019/extlst" xmlns:r="http://schemas.openxmlformats.org/officeDocument/2006/relationships" xmlns:m="http://schemas.openxmlformats.org/officeDocument/2006/math" xmlns:v="urn:schemas-microsoft-com:vml" xmlns:wp14="http://schemas.microsoft.com/office/word/2010/wordprocessingDrawing" xmlns:wp="http://schemas.openxmlformats.org/drawingml/2006/wordprocessingDrawing" xmlns:w10="urn:schemas-microsoft-com:office:word" xmlns:w="http://schemas.openxmlformats.org/wordprocessingml/2006/main" xmlns:w14="http://schemas.microsoft.com/office/word/2010/wordml" xmlns:w15="http://schemas.microsoft.com/office/word/2012/wordml" xmlns:w16cex="http://schemas.microsoft.com/office/word/2018/wordml/cex" xmlns:w16cid="http://schemas.microsoft.com/office/word/2016/wordml/cid" xmlns:w16="http://schemas.microsoft.com/office/word/2018/wordml" xmlns:w16du="http://schemas.microsoft.com/office/word/2023/wordml/word16du" xmlns:w16sdtdh="http://schemas.microsoft.com/office/word/2020/wordml/sdtdatahash" xmlns:w16sdtfl="http://schemas.microsoft.com/office/word/2024/wordml/sdtformatlock" xmlns:w16se="http://schemas.microsoft.com/office/word/2015/wordml/symex" xmlns:wpg="http://schemas.microsoft.com/office/word/2010/wordprocessingGroup" xmlns:wpi="http://schemas.microsoft.com/office/word/2010/wordprocessingInk" xmlns:wne="http://schemas.microsoft.com/office/word/2006/wordml" xmlns:wps="http://schemas.microsoft.com/office/word/2010/wordprocessingShape" mc:Ignorable="w14 w15 w16se w16cid w16 w16cex w16sdtdh w16sdtfl w16du wp14">
+  <w:p>
+    <w:pPr>
+      <w:pStyle w:val="Footer"/>
+      <w:jc w:val="center"/>
+    </w:pPr>
+    <w:r>
+      <w:rPr>
+        <w:sz w:val="16"/>
+      </w:rPr>
+      <w:t>Educational project • Lightweight configuration review</w:t>
+    </w:r>
+  </w:p>
+</w:ftr>
+</file>
+
+<file path=word/footnotes.xml><?xml version="1.0" encoding="utf-8"?>
+<w:footnotes xmlns:wpc="http://schemas.microsoft.com/office/word/2010/wordprocessingCanvas" xmlns:cx="http://schemas.microsoft.com/office/drawing/2014/chartex" xmlns:cx1="http://schemas.microsoft.com/office/drawing/2015/9/8/chartex" xmlns:cx2="http://schemas.microsoft.com/office/drawing/2015/10/21/chartex" xmlns:cx3="http://schemas.microsoft.com/office/drawing/2016/5/9/chartex" xmlns:cx4="http://schemas.microsoft.com/office/drawing/2016/5/10/chartex" xmlns:cx5="http://schemas.microsoft.com/office/drawing/2016/5/11/chartex" xmlns:cx6="http://schemas.microsoft.com/office/drawing/2016/5/12/chartex" xmlns:cx7="http://schemas.microsoft.com/office/drawing/2016/5/13/chartex" xmlns:cx8="http://schemas.microsoft.com/office/drawing/2016/5/14/chartex" xmlns:mc="http://schemas.openxmlformats.org/markup-compatibility/2006" xmlns:aink="http://schemas.microsoft.com/office/drawing/2016/ink" xmlns:am3d="http://schemas.microsoft.com/office/drawing/2017/model3d" xmlns:o="urn:schemas-microsoft-com:office:office" xmlns:oel="http://schemas.microsoft.com/office/2019/extlst" xmlns:r="http://schemas.openxmlformats.org/officeDocument/2006/relationships" xmlns:m="http://schemas.openxmlformats.org/officeDocument/2006/math" xmlns:v="urn:schemas-microsoft-com:vml" xmlns:wp14="http://schemas.microsoft.com/office/word/2010/wordprocessingDrawing" xmlns:wp="http://schemas.openxmlformats.org/drawingml/2006/wordprocessingDrawing" xmlns:w10="urn:schemas-microsoft-com:office:word" xmlns:w="http://schemas.openxmlformats.org/wordprocessingml/2006/main" xmlns:w14="http://schemas.microsoft.com/office/word/2010/wordml" xmlns:w15="http://schemas.microsoft.com/office/word/2012/wordml" xmlns:w16cex="http://schemas.microsoft.com/office/word/2018/wordml/cex" xmlns:w16cid="http://schemas.microsoft.com/office/word/2016/wordml/cid" xmlns:w16="http://schemas.microsoft.com/office/word/2018/wordml" xmlns:w16du="http://schemas.microsoft.com/office/word/2023/wordml/word16du" xmlns:w16sdtdh="http://schemas.microsoft.com/office/word/2020/wordml/sdtdatahash" xmlns:w16sdtfl="http://schemas.microsoft.com/office/word/2024/wordml/sdtformatlock" xmlns:w16se="http://schemas.microsoft.com/office/word/2015/wordml/symex" xmlns:wpg="http://schemas.microsoft.com/office/word/2010/wordprocessingGroup" xmlns:wpi="http://schemas.microsoft.com/office/word/2010/wordprocessingInk" xmlns:wne="http://schemas.microsoft.com/office/word/2006/wordml" xmlns:wps="http://schemas.microsoft.com/office/word/2010/wordprocessingShape" mc:Ignorable="w14 w15 w16se w16cid w16 w16cex w16sdtdh w16sdtfl w16du wp14">
+  <w:footnote w:type="separator" w:id="-1">
+    <w:p>
+      <w:pPr>
+        <w:spacing w:after="0" w:line="240" w:lineRule="auto"/>
+      </w:pPr>
+      <w:r>
+        <w:separator/>
+      </w:r>
+    </w:p>
+  </w:footnote>
+  <w:footnote w:type="continuationSeparator" w:id="0">
+    <w:p>
+      <w:pPr>
+        <w:spacing w:after="0" w:line="240" w:lineRule="auto"/>
+      </w:pPr>
+      <w:r>
+        <w:continuationSeparator/>
+      </w:r>
+    </w:p>
+  </w:footnote>
+</w:footnotes>
+</file>
+
+<file path=word/header1.xml><?xml version="1.0" encoding="utf-8"?>
+<w:hdr xmlns:wpc="http://schemas.microsoft.com/office/word/2010/wordprocessingCanvas" xmlns:cx="http://schemas.microsoft.com/office/drawing/2014/chartex" xmlns:cx1="http://schemas.microsoft.com/office/drawing/2015/9/8/chartex" xmlns:cx2="http://schemas.microsoft.com/office/drawing/2015/10/21/chartex" xmlns:cx3="http://schemas.microsoft.com/office/drawing/2016/5/9/chartex" xmlns:cx4="http://schemas.microsoft.com/office/drawing/2016/5/10/chartex" xmlns:cx5="http://schemas.microsoft.com/office/drawing/2016/5/11/chartex" xmlns:cx6="http://schemas.microsoft.com/office/drawing/2016/5/12/chartex" xmlns:cx7="http://schemas.microsoft.com/office/drawing/2016/5/13/chartex" xmlns:cx8="http://schemas.microsoft.com/office/drawing/2016/5/14/chartex" xmlns:mc="http://schemas.openxmlformats.org/markup-compatibility/2006" xmlns:aink="http://schemas.microsoft.com/office/drawing/2016/ink" xmlns:am3d="http://schemas.microsoft.com/office/drawing/2017/model3d" xmlns:o="urn:schemas-microsoft-com:office:office" xmlns:oel="http://schemas.microsoft.com/office/2019/extlst" xmlns:r="http://schemas.openxmlformats.org/officeDocument/2006/relationships" xmlns:m="http://schemas.openxmlformats.org/officeDocument/2006/math" xmlns:v="urn:schemas-microsoft-com:vml" xmlns:wp14="http://schemas.microsoft.com/office/word/2010/wordprocessingDrawing" xmlns:wp="http://schemas.openxmlformats.org/drawingml/2006/wordprocessingDrawing" xmlns:w10="urn:schemas-microsoft-com:office:word" xmlns:w="http://schemas.openxmlformats.org/wordprocessingml/2006/main" xmlns:w14="http://schemas.microsoft.com/office/word/2010/wordml" xmlns:w15="http://schemas.microsoft.com/office/word/2012/wordml" xmlns:w16cex="http://schemas.microsoft.com/office/word/2018/wordml/cex" xmlns:w16cid="http://schemas.microsoft.com/office/word/2016/wordml/cid" xmlns:w16="http://schemas.microsoft.com/office/word/2018/wordml" xmlns:w16du="http://schemas.microsoft.com/office/word/2023/wordml/word16du" xmlns:w16sdtdh="http://schemas.microsoft.com/office/word/2020/wordml/sdtdatahash" xmlns:w16sdtfl="http://schemas.microsoft.com/office/word/2024/wordml/sdtformatlock" xmlns:w16se="http://schemas.microsoft.com/office/word/2015/wordml/symex" xmlns:wpg="http://schemas.microsoft.com/office/word/2010/wordprocessingGroup" xmlns:wpi="http://schemas.microsoft.com/office/word/2010/wordprocessingInk" xmlns:wne="http://schemas.microsoft.com/office/word/2006/wordml" xmlns:wps="http://schemas.microsoft.com/office/word/2010/wordprocessingShape" mc:Ignorable="w14 w15 w16se w16cid w16 w16cex w16sdtdh w16sdtfl w16du wp14">
+  <w:p>
+    <w:pPr>
+      <w:pStyle w:val="Header"/>
+      <w:jc w:val="right"/>
+    </w:pPr>
+    <w:r>
+      <w:rPr>
+        <w:color w:val="646464"/>
+        <w:sz w:val="16"/>
+      </w:rPr>
+      <w:t xml:space="preserve">AUTOMATED WEB SECURITY </w:t>
+    </w:r>
+    <w:proofErr w:type="gramStart"/>
+    <w:r>
+      <w:rPr>
+        <w:color w:val="646464"/>
+        <w:sz w:val="16"/>
+      </w:rPr>
+      <w:t>SCANNER  |</w:t>
+    </w:r>
+    <w:proofErr w:type="gramEnd"/>
+    <w:r>
+      <w:rPr>
+        <w:color w:val="646464"/>
+        <w:sz w:val="16"/>
+      </w:rPr>
+      <w:t xml:space="preserve">  PROJECT REPORT</w:t>
+    </w:r>
+  </w:p>
+</w:hdr>
 </file>
 
 <file path=word/numbering.xml><?xml version="1.0" encoding="utf-8"?>
@@ -847,31 +2708,31 @@
       </w:rPr>
     </w:lvl>
   </w:abstractNum>
-  <w:num w:numId="1" w16cid:durableId="1993024177">
+  <w:num w:numId="1" w16cid:durableId="795952663">
     <w:abstractNumId w:val="8"/>
   </w:num>
-  <w:num w:numId="2" w16cid:durableId="1577007054">
+  <w:num w:numId="2" w16cid:durableId="1684013300">
     <w:abstractNumId w:val="6"/>
   </w:num>
-  <w:num w:numId="3" w16cid:durableId="89788088">
+  <w:num w:numId="3" w16cid:durableId="2020497974">
     <w:abstractNumId w:val="5"/>
   </w:num>
-  <w:num w:numId="4" w16cid:durableId="1479803753">
+  <w:num w:numId="4" w16cid:durableId="542059189">
     <w:abstractNumId w:val="4"/>
   </w:num>
-  <w:num w:numId="5" w16cid:durableId="2055150260">
+  <w:num w:numId="5" w16cid:durableId="1369333492">
     <w:abstractNumId w:val="7"/>
   </w:num>
-  <w:num w:numId="6" w16cid:durableId="1402826132">
+  <w:num w:numId="6" w16cid:durableId="757361325">
     <w:abstractNumId w:val="3"/>
   </w:num>
-  <w:num w:numId="7" w16cid:durableId="100229566">
+  <w:num w:numId="7" w16cid:durableId="1103571603">
     <w:abstractNumId w:val="2"/>
   </w:num>
-  <w:num w:numId="8" w16cid:durableId="1042053808">
+  <w:num w:numId="8" w16cid:durableId="780494719">
     <w:abstractNumId w:val="1"/>
   </w:num>
-  <w:num w:numId="9" w16cid:durableId="1803646463">
+  <w:num w:numId="9" w16cid:durableId="257104729">
     <w:abstractNumId w:val="0"/>
   </w:num>
 </w:numbering>
@@ -1267,8 +3128,11 @@
     <w:name w:val="Normal"/>
     <w:qFormat/>
     <w:rsid w:val="00FC693F"/>
+    <w:pPr>
+      <w:spacing w:after="120"/>
+    </w:pPr>
     <w:rPr>
-      <w:rFonts w:ascii="Arial" w:hAnsi="Arial"/>
+      <w:rFonts w:ascii="Aptos" w:hAnsi="Aptos"/>
       <w:sz w:val="20"/>
     </w:rPr>
   </w:style>
@@ -1290,8 +3154,8 @@
       <w:rFonts w:asciiTheme="majorHAnsi" w:eastAsiaTheme="majorEastAsia" w:hAnsiTheme="majorHAnsi" w:cstheme="majorBidi"/>
       <w:b/>
       <w:bCs/>
-      <w:color w:val="1F4E79"/>
-      <w:sz w:val="28"/>
+      <w:color w:val="17365D"/>
+      <w:sz w:val="36"/>
       <w:szCs w:val="28"/>
     </w:rPr>
   </w:style>
@@ -1314,7 +3178,7 @@
       <w:rFonts w:asciiTheme="majorHAnsi" w:eastAsiaTheme="majorEastAsia" w:hAnsiTheme="majorHAnsi" w:cstheme="majorBidi"/>
       <w:b/>
       <w:bCs/>
-      <w:color w:val="1F4E79"/>
+      <w:color w:val="2F5597"/>
       <w:sz w:val="26"/>
       <w:szCs w:val="26"/>
     </w:rPr>
@@ -1338,7 +3202,8 @@
       <w:rFonts w:asciiTheme="majorHAnsi" w:eastAsiaTheme="majorEastAsia" w:hAnsiTheme="majorHAnsi" w:cstheme="majorBidi"/>
       <w:b/>
       <w:bCs/>
-      <w:color w:val="4F81BD" w:themeColor="accent1"/>
+      <w:color w:val="2F5597"/>
+      <w:sz w:val="22"/>
     </w:rPr>
   </w:style>
   <w:style w:type="paragraph" w:styleId="Heading4">
@@ -1619,7 +3484,8 @@
     </w:pPr>
     <w:rPr>
       <w:rFonts w:asciiTheme="majorHAnsi" w:eastAsiaTheme="majorEastAsia" w:hAnsiTheme="majorHAnsi" w:cstheme="majorBidi"/>
-      <w:color w:val="17365D" w:themeColor="text2" w:themeShade="BF"/>
+      <w:b/>
+      <w:color w:val="17365D"/>
       <w:spacing w:val="5"/>
       <w:kern w:val="28"/>
       <w:sz w:val="52"/>
@@ -1698,9 +3564,6 @@
     <w:uiPriority w:val="99"/>
     <w:unhideWhenUsed/>
     <w:rsid w:val="00AA1D8D"/>
-    <w:pPr>
-      <w:spacing w:after="120"/>
-    </w:pPr>
   </w:style>
   <w:style w:type="character" w:customStyle="1" w:styleId="BodyTextChar">
     <w:name w:val="Body Text Char"/>
@@ -1717,7 +3580,7 @@
     <w:unhideWhenUsed/>
     <w:rsid w:val="00AA1D8D"/>
     <w:pPr>
-      <w:spacing w:after="120" w:line="480" w:lineRule="auto"/>
+      <w:spacing w:line="480" w:lineRule="auto"/>
     </w:pPr>
   </w:style>
   <w:style w:type="character" w:customStyle="1" w:styleId="BodyText2Char">
@@ -1734,9 +3597,6 @@
     <w:uiPriority w:val="99"/>
     <w:unhideWhenUsed/>
     <w:rsid w:val="00AA1D8D"/>
-    <w:pPr>
-      <w:spacing w:after="120"/>
-    </w:pPr>
     <w:rPr>
       <w:sz w:val="16"/>
       <w:szCs w:val="16"/>
@@ -1871,7 +3731,6 @@
     <w:unhideWhenUsed/>
     <w:rsid w:val="0029639D"/>
     <w:pPr>
-      <w:spacing w:after="120"/>
       <w:ind w:left="360"/>
       <w:contextualSpacing/>
     </w:pPr>
@@ -1883,7 +3742,6 @@
     <w:unhideWhenUsed/>
     <w:rsid w:val="0029639D"/>
     <w:pPr>
-      <w:spacing w:after="120"/>
       <w:ind w:left="720"/>
       <w:contextualSpacing/>
     </w:pPr>
@@ -1895,7 +3753,6 @@
     <w:unhideWhenUsed/>
     <w:rsid w:val="0029639D"/>
     <w:pPr>
-      <w:spacing w:after="120"/>
       <w:ind w:left="1080"/>
       <w:contextualSpacing/>
     </w:pPr>

</xml_diff>